<commit_message>
Cambio de enfoque: documentos para personas (madre, glosario, auditoría, conceptos), cronograma día a día en Excel, roles corregidos, búsqueda con Chrome (#1 #10 #54) [IA: Claude]
Co-Authored-By: Claude Opus 5.5 <noreply@anthropic.com>
</commit_message>
<xml_diff>
--- a/GUIA_DIEGO.docx
+++ b/GUIA_DIEGO.docx
@@ -49,7 +49,7 @@
                 <w:color w:val="E6C3A0"/>
                 <w:sz w:val="22"/>
               </w:rPr>
-              <w:t>Versión v1.0</w:t>
+              <w:t>Versión v2.0</w:t>
             </w:r>
           </w:p>
           <w:p>
@@ -77,7 +77,7 @@
         </w:pBdr>
       </w:pPr>
       <w:r>
-        <w:t>1. El proyecto en 1 minuto</w:t>
+        <w:t>1. El proyecto en un minuto</w:t>
       </w:r>
     </w:p>
     <w:p>
@@ -89,7 +89,7 @@
       </w:r>
       <w:r>
         <w:rPr/>
-        <w:t xml:space="preserve"> «Diseño de un sistema de automatización para la gestión comercial en la Constructora Torvesa». Es un Proyecto Técnico (DSR) en la carrera de Negocios Digitales de la UPS, con la tutora Ing. Tania Chicaiza.</w:t>
+        <w:t xml:space="preserve"> «Diseño de un sistema de automatización para la gestión comercial en la Constructora Torvesa». Es la tesis de Víctor y tuya en Negocios Digitales (UPS). La tutora es la Ing. Tania Chicaiza.</w:t>
       </w:r>
     </w:p>
     <w:p>
@@ -101,7 +101,7 @@
       </w:r>
       <w:r>
         <w:rPr/>
-        <w:t xml:space="preserve"> en Torvesa cada cotización se arma casi desde cero, el historial de cada cliente vive en el teléfono del vendedor y las solicitudes esperan horas o días.</w:t>
+        <w:t xml:space="preserve"> en Torvesa, cada cotización se hace casi desde cero. Lo que se sabe de cada cliente está en el celular del vendedor y las solicitudes esperan horas o días.</w:t>
       </w:r>
     </w:p>
     <w:p>
@@ -109,11 +109,11 @@
         <w:rPr>
           <w:b/>
         </w:rPr>
-        <w:t>Lo que diseñamos:</w:t>
+        <w:t>Lo que vamos a diseñar:</w:t>
       </w:r>
       <w:r>
         <w:rPr/>
-        <w:t xml:space="preserve"> sobre TEAMSLASH (landing → API → PostgreSQL → Slack) se agregan tres componentes:</w:t>
+        <w:t xml:space="preserve"> el CRM TEAMSLASH (el sistema de clientes que ustedes hicieron en el proyecto integrador) más tres piezas nuevas:</w:t>
       </w:r>
     </w:p>
     <w:p>
@@ -128,11 +128,11 @@
         <w:rPr>
           <w:b/>
         </w:rPr>
-        <w:t>bóveda Obsidian</w:t>
+        <w:t>bóveda de conocimiento</w:t>
       </w:r>
       <w:r>
         <w:rPr/>
-        <w:t xml:space="preserve"> con fichas, plantillas y cotizaciones;</w:t>
+        <w:t xml:space="preserve"> en Obsidian, con fichas de clientes, plantillas y cotizaciones anteriores;</w:t>
       </w:r>
     </w:p>
     <w:p>
@@ -151,7 +151,7 @@
       </w:r>
       <w:r>
         <w:rPr/>
-        <w:t xml:space="preserve"> que consulta la bóveda y propone borradores de cotización;</w:t>
+        <w:t xml:space="preserve"> que lee esa bóveda y propone un borrador de cotización;</w:t>
       </w:r>
     </w:p>
     <w:p>
@@ -166,57 +166,37 @@
         <w:rPr>
           <w:b/>
         </w:rPr>
-        <w:t>registro de eventos verificable</w:t>
+        <w:t>registro de lo que pasa con cada cliente</w:t>
       </w:r>
       <w:r>
         <w:rPr/>
-        <w:t>.</w:t>
+        <w:t>, que no se puede alterar.</w:t>
       </w:r>
     </w:p>
     <w:p>
       <w:r>
         <w:rPr/>
-        <w:t xml:space="preserve">Se valida en una </w:t>
+        <w:t xml:space="preserve">Es </w:t>
       </w:r>
       <w:r>
         <w:rPr>
           <w:b/>
         </w:rPr>
-        <w:t>operación experimental controlada</w:t>
+        <w:t>solo diseño</w:t>
       </w:r>
       <w:r>
         <w:rPr/>
-        <w:t xml:space="preserve"> de 2 semanas (24-nov → 5-dic). </w:t>
+        <w:t xml:space="preserve">. Se prueba durante unos días con el equipo de Torvesa en una </w:t>
       </w:r>
       <w:r>
         <w:rPr>
           <w:b/>
         </w:rPr>
-        <w:t>Nunca se dice «implementado».</w:t>
-      </w:r>
-    </w:p>
-    <w:p>
-      <w:r>
-        <w:rPr>
-          <w:b/>
-        </w:rPr>
-        <w:t>Tu rol:</w:t>
+        <w:t>«validación del diseño en operación experimental controlada»</w:t>
       </w:r>
       <w:r>
         <w:rPr/>
-        <w:t xml:space="preserve"> todo lo técnico y digital: bóveda del sistema, RAG, flujogramas (AS-IS/TO-BE), arquitectura, prueba de concepto, casos de prueba y pruebas.</w:t>
-      </w:r>
-    </w:p>
-    <w:p>
-      <w:r>
-        <w:rPr>
-          <w:b/>
-        </w:rPr>
-        <w:t>Rol de Víctor:</w:t>
-      </w:r>
-      <w:r>
-        <w:rPr/>
-        <w:t xml:space="preserve"> documento de tesis, investigación y fuentes, APA, instrumentos, análisis financiero, y la relación con la tutora y con Torvesa.</w:t>
+        <w:t>. Nunca decimos «implementado» ni «piloto».</w:t>
       </w:r>
     </w:p>
     <w:tbl>
@@ -256,17 +236,7 @@
             </w:r>
             <w:r>
               <w:rPr/>
-              <w:t xml:space="preserve">. No se usan. La línea base real se levanta en campo el </w:t>
-            </w:r>
-            <w:r>
-              <w:rPr>
-                <w:b/>
-              </w:rPr>
-              <w:t>jueves 15 y el viernes 16 de octubre</w:t>
-            </w:r>
-            <w:r>
-              <w:rPr/>
-              <w:t>, y tú estás en el cronometraje y la muestra documental.</w:t>
+              <w:t xml:space="preserve"> (de práctica). No se usan. Los datos reales se levantan en Torvesa si la empresa lo autoriza.</w:t>
             </w:r>
           </w:p>
         </w:tc>
@@ -281,25 +251,7 @@
         </w:pBdr>
       </w:pPr>
       <w:r>
-        <w:t>2. Cómo está organizado el repo</w:t>
-      </w:r>
-    </w:p>
-    <w:p>
-      <w:r>
-        <w:rPr/>
-        <w:t xml:space="preserve">Empieza por el portal </w:t>
-      </w:r>
-      <w:r>
-        <w:rPr>
-          <w:rFonts w:ascii="Consolas" w:hAnsi="Consolas" w:cs="Consolas" w:eastAsia="Consolas"/>
-          <w:color w:val="0B1F3A"/>
-          <w:sz w:val="19"/>
-        </w:rPr>
-        <w:t>README.md</w:t>
-      </w:r>
-      <w:r>
-        <w:rPr/>
-        <w:t>. Tus carpetas:</w:t>
+        <w:t>2. Quién hace qué</w:t>
       </w:r>
     </w:p>
     <w:tbl>
@@ -339,7 +291,7 @@
                 <w:color w:val="FFFFFF"/>
                 <w:sz w:val="19"/>
               </w:rPr>
-              <w:t>Carpeta</w:t>
+              <w:t>Víctor</w:t>
             </w:r>
           </w:p>
         </w:tc>
@@ -360,7 +312,7 @@
                 <w:color w:val="FFFFFF"/>
                 <w:sz w:val="19"/>
               </w:rPr>
-              <w:t>Qué haces ahí</w:t>
+              <w:t>Diego (tú)</w:t>
             </w:r>
           </w:p>
         </w:tc>
@@ -381,11 +333,9 @@
             </w:r>
             <w:r>
               <w:rPr>
-                <w:rFonts w:ascii="Consolas" w:hAnsi="Consolas" w:cs="Consolas" w:eastAsia="Consolas"/>
-                <w:color w:val="0B1F3A"/>
                 <w:sz w:val="19"/>
               </w:rPr>
-              <w:t>07_Flujos_Diseno/</w:t>
+              <w:t>El documento de tesis, las fuentes y la metodología</w:t>
             </w:r>
           </w:p>
         </w:tc>
@@ -404,9 +354,10 @@
             </w:r>
             <w:r>
               <w:rPr>
+                <w:b/>
                 <w:sz w:val="19"/>
               </w:rPr>
-              <w:t>BPMN AS-IS/TO-BE, arquitectura, modelo de datos, inventario de herramientas</w:t>
+              <w:t>Todo lo técnico y digital</w:t>
             </w:r>
           </w:p>
         </w:tc>
@@ -428,11 +379,9 @@
             </w:r>
             <w:r>
               <w:rPr>
-                <w:rFonts w:ascii="Consolas" w:hAnsi="Consolas" w:cs="Consolas" w:eastAsia="Consolas"/>
-                <w:color w:val="0B1F3A"/>
                 <w:sz w:val="19"/>
               </w:rPr>
-              <w:t>99_Scripts/</w:t>
+              <w:t>El modelo de negocio y la evaluación financiera (costos, VAN, TIR)</w:t>
             </w:r>
           </w:p>
         </w:tc>
@@ -454,35 +403,7 @@
               <w:rPr>
                 <w:sz w:val="19"/>
               </w:rPr>
-              <w:t>RAG (</w:t>
-            </w:r>
-            <w:r>
-              <w:rPr>
-                <w:rFonts w:ascii="Consolas" w:hAnsi="Consolas" w:cs="Consolas" w:eastAsia="Consolas"/>
-                <w:color w:val="0B1F3A"/>
-                <w:sz w:val="19"/>
-              </w:rPr>
-              <w:t>rag/</w:t>
-            </w:r>
-            <w:r>
-              <w:rPr>
-                <w:sz w:val="19"/>
-              </w:rPr>
-              <w:t>), auditoría PII, sincronización con GitHub e informes (</w:t>
-            </w:r>
-            <w:r>
-              <w:rPr>
-                <w:rFonts w:ascii="Consolas" w:hAnsi="Consolas" w:cs="Consolas" w:eastAsia="Consolas"/>
-                <w:color w:val="0B1F3A"/>
-                <w:sz w:val="19"/>
-              </w:rPr>
-              <w:t>gestion/</w:t>
-            </w:r>
-            <w:r>
-              <w:rPr>
-                <w:sz w:val="19"/>
-              </w:rPr>
-              <w:t>)</w:t>
+              <w:t>Los procesos dibujados (cómo funciona hoy y cómo funcionará), la arquitectura y la bóveda del sistema</w:t>
             </w:r>
           </w:p>
         </w:tc>
@@ -503,11 +424,9 @@
             </w:r>
             <w:r>
               <w:rPr>
-                <w:rFonts w:ascii="Consolas" w:hAnsi="Consolas" w:cs="Consolas" w:eastAsia="Consolas"/>
-                <w:color w:val="0B1F3A"/>
                 <w:sz w:val="19"/>
               </w:rPr>
-              <w:t>05_Datos_Campo/</w:t>
+              <w:t>Cómo se «vende» la idea (propuesta de valor, pitch)</w:t>
             </w:r>
           </w:p>
         </w:tc>
@@ -528,20 +447,53 @@
               <w:rPr>
                 <w:sz w:val="19"/>
               </w:rPr>
-              <w:t xml:space="preserve">análisis de los datos de campo (solo </w:t>
+              <w:t>La búsqueda con IA (RAG), la prueba de concepto y las pruebas</w:t>
             </w:r>
+          </w:p>
+        </w:tc>
+      </w:tr>
+      <w:tr>
+        <w:tc>
+          <w:tcPr>
+            <w:tcW w:type="dxa" w:w="4873"/>
+            <w:shd w:val="clear" w:color="auto" w:fill="EEF2F7"/>
+          </w:tcPr>
+          <w:p>
+            <w:pPr>
+              <w:spacing w:after="20"/>
+            </w:pPr>
             <w:r>
               <w:rPr>
-                <w:b/>
                 <w:sz w:val="19"/>
               </w:rPr>
-              <w:t>anonimizados</w:t>
             </w:r>
             <w:r>
               <w:rPr>
                 <w:sz w:val="19"/>
               </w:rPr>
-              <w:t>)</w:t>
+              <w:t>Explicarte los conceptos de negocio para que tú los traduzcas a tecnología</w:t>
+            </w:r>
+          </w:p>
+        </w:tc>
+        <w:tc>
+          <w:tcPr>
+            <w:tcW w:type="dxa" w:w="4873"/>
+            <w:shd w:val="clear" w:color="auto" w:fill="EEF2F7"/>
+          </w:tcPr>
+          <w:p>
+            <w:pPr>
+              <w:spacing w:after="20"/>
+            </w:pPr>
+            <w:r>
+              <w:rPr>
+                <w:sz w:val="19"/>
+              </w:rPr>
+            </w:r>
+            <w:r>
+              <w:rPr>
+                <w:sz w:val="19"/>
+              </w:rPr>
+              <w:t>Explicarle a Víctor lo técnico en lenguaje simple</w:t>
             </w:r>
           </w:p>
         </w:tc>
@@ -550,8 +502,32 @@
     <w:p/>
     <w:p>
       <w:r>
+        <w:rPr>
+          <w:b/>
+        </w:rPr>
+        <w:t>No tendrás acceso a la bóveda personal de Víctor (bóveda 1).</w:t>
+      </w:r>
+      <w:r>
         <w:rPr/>
-        <w:t>Las demás carpetas son de Víctor o compartidas. Puedes leer y comentar en todas.</w:t>
+        <w:t xml:space="preserve"> Más adelante (sprint 3, issue #60), Víctor escribirá un documento con los </w:t>
+      </w:r>
+      <w:r>
+        <w:rPr>
+          <w:b/>
+        </w:rPr>
+        <w:t>patrones</w:t>
+      </w:r>
+      <w:r>
+        <w:rPr/>
+        <w:t xml:space="preserve"> de cómo la organizó (sin datos), para que lo uses al diseñar la bóveda del sistema.</w:t>
+      </w:r>
+    </w:p>
+    <w:p>
+      <w:r>
+        <w:rPr>
+          <w:b/>
+        </w:rPr>
+        <w:t>La bóveda del sistema se construye en el sprint 4 (2–8 nov), no ahora.</w:t>
       </w:r>
     </w:p>
     <w:p>
@@ -562,427 +538,13 @@
         </w:pBdr>
       </w:pPr>
       <w:r>
-        <w:t>3. Tu primera semana, paso a paso</w:t>
-      </w:r>
-    </w:p>
-    <w:p>
-      <w:pPr>
-        <w:pStyle w:val="ListNumber"/>
-      </w:pPr>
-      <w:r>
-        <w:rPr>
-          <w:b/>
-        </w:rPr>
-        <w:t>Acepta la invitación:</w:t>
-      </w:r>
-      <w:r>
-        <w:rPr/>
-        <w:t xml:space="preserve"> </w:t>
-      </w:r>
-      <w:hyperlink r:id="rId10">
-        <w:r>
-          <w:rPr>
-            <w:color w:val="B87333"/>
-            <w:u w:val="single"/>
-          </w:rPr>
-          <w:t xml:space="preserve">https://github.com/l333x/Tesis_Torvesa/invitations</w:t>
-        </w:r>
-      </w:hyperlink>
-      <w:r>
-        <w:rPr/>
-        <w:t xml:space="preserve"> → </w:t>
-      </w:r>
-      <w:r>
-        <w:rPr>
-          <w:i/>
-        </w:rPr>
-        <w:t>Accept</w:t>
-      </w:r>
-      <w:r>
-        <w:rPr/>
-        <w:t>. Caduca a los 7 días del envío (11-oct).</w:t>
-      </w:r>
-    </w:p>
-    <w:p>
-      <w:pPr>
-        <w:pStyle w:val="ListNumber"/>
-      </w:pPr>
-      <w:r>
-        <w:rPr>
-          <w:b/>
-        </w:rPr>
-        <w:t>Instala, inicia sesión y clona:</w:t>
-      </w:r>
-      <w:r>
-        <w:rPr/>
-        <w:t xml:space="preserve"> sigue la sección «Primera vez — Diego» de </w:t>
-      </w:r>
-      <w:r>
-        <w:rPr>
-          <w:rFonts w:ascii="Consolas" w:hAnsi="Consolas" w:cs="Consolas" w:eastAsia="Consolas"/>
-          <w:color w:val="0B1F3A"/>
-          <w:sz w:val="19"/>
-        </w:rPr>
-        <w:t>COLABORACION.md</w:t>
-      </w:r>
-      <w:r>
-        <w:rPr/>
-        <w:t>:</w:t>
-      </w:r>
-    </w:p>
-    <w:p>
-      <w:pPr>
-        <w:pStyle w:val="ListBullet"/>
-        <w:ind w:left="714"/>
-      </w:pPr>
-      <w:r>
-        <w:rPr>
-          <w:rFonts w:ascii="Consolas" w:hAnsi="Consolas" w:cs="Consolas" w:eastAsia="Consolas"/>
-          <w:color w:val="0B1F3A"/>
-          <w:sz w:val="19"/>
-        </w:rPr>
-        <w:t>gh auth login</w:t>
-      </w:r>
-      <w:r>
-        <w:rPr/>
-        <w:t xml:space="preserve"> con </w:t>
-      </w:r>
-      <w:r>
-        <w:rPr>
-          <w:b/>
-        </w:rPr>
-        <w:t>tu propia</w:t>
-      </w:r>
-      <w:r>
-        <w:rPr/>
-        <w:t xml:space="preserve"> clave SSH;</w:t>
-      </w:r>
-    </w:p>
-    <w:p>
-      <w:pPr>
-        <w:pStyle w:val="ListBullet"/>
-        <w:ind w:left="714"/>
-      </w:pPr>
-      <w:r>
-        <w:rPr>
-          <w:rFonts w:ascii="Consolas" w:hAnsi="Consolas" w:cs="Consolas" w:eastAsia="Consolas"/>
-          <w:color w:val="0B1F3A"/>
-          <w:sz w:val="19"/>
-        </w:rPr>
-        <w:t>gh repo clone l333x/Tesis_Torvesa</w:t>
-      </w:r>
-      <w:r>
-        <w:rPr/>
-        <w:t xml:space="preserve"> en una carpeta </w:t>
-      </w:r>
-      <w:r>
-        <w:rPr>
-          <w:b/>
-        </w:rPr>
-        <w:t>fuera de OneDrive</w:t>
-      </w:r>
-      <w:r>
-        <w:rPr/>
-        <w:t>;</w:t>
-      </w:r>
-    </w:p>
-    <w:p>
-      <w:pPr>
-        <w:pStyle w:val="ListBullet"/>
-        <w:ind w:left="714"/>
-      </w:pPr>
-      <w:r>
-        <w:rPr/>
-        <w:t>abre la carpeta como bóveda en Obsidian.</w:t>
-      </w:r>
-    </w:p>
-    <w:p>
-      <w:pPr>
-        <w:pStyle w:val="ListNumber"/>
-      </w:pPr>
-      <w:r>
-        <w:rPr>
-          <w:b/>
-        </w:rPr>
-        <w:t>Levanta el RAG:</w:t>
-      </w:r>
-      <w:r>
-        <w:rPr/>
-        <w:t xml:space="preserve"> </w:t>
-      </w:r>
-      <w:r>
-        <w:rPr>
-          <w:rFonts w:ascii="Consolas" w:hAnsi="Consolas" w:cs="Consolas" w:eastAsia="Consolas"/>
-          <w:color w:val="0B1F3A"/>
-          <w:sz w:val="19"/>
-        </w:rPr>
-        <w:t>RAG_README.md</w:t>
-      </w:r>
-      <w:r>
-        <w:rPr/>
-        <w:t xml:space="preserve">. Comprueba que </w:t>
-      </w:r>
-      <w:r>
-        <w:rPr>
-          <w:rFonts w:ascii="Consolas" w:hAnsi="Consolas" w:cs="Consolas" w:eastAsia="Consolas"/>
-          <w:color w:val="0B1F3A"/>
-          <w:sz w:val="19"/>
-        </w:rPr>
-        <w:t>rag.py consultar "tiempo de elaboración de cotizaciones"</w:t>
-      </w:r>
-      <w:r>
-        <w:rPr/>
-        <w:t xml:space="preserve"> devuelva resultados.</w:t>
-      </w:r>
-    </w:p>
-    <w:p>
-      <w:pPr>
-        <w:pStyle w:val="ListNumber"/>
-      </w:pPr>
-      <w:r>
-        <w:rPr>
-          <w:b/>
-        </w:rPr>
-        <w:t>Commit de prueba:</w:t>
-      </w:r>
-      <w:r>
-        <w:rPr/>
-        <w:t xml:space="preserve"> crea </w:t>
-      </w:r>
-      <w:r>
-        <w:rPr>
-          <w:rFonts w:ascii="Consolas" w:hAnsi="Consolas" w:cs="Consolas" w:eastAsia="Consolas"/>
-          <w:color w:val="0B1F3A"/>
-          <w:sz w:val="19"/>
-        </w:rPr>
-        <w:t>00_Inbox/hola_diego.md</w:t>
-      </w:r>
-      <w:r>
-        <w:rPr/>
-        <w:t xml:space="preserve">, haz commit con </w:t>
-      </w:r>
-      <w:r>
-        <w:rPr>
-          <w:rFonts w:ascii="Consolas" w:hAnsi="Consolas" w:cs="Consolas" w:eastAsia="Consolas"/>
-          <w:color w:val="0B1F3A"/>
-          <w:sz w:val="19"/>
-        </w:rPr>
-        <w:t>S1-10: commit de prueba (closes #10)</w:t>
-      </w:r>
-      <w:r>
-        <w:rPr/>
-        <w:t xml:space="preserve"> y push. Eso cierra tu primer issue.</w:t>
-      </w:r>
-    </w:p>
-    <w:p>
-      <w:pPr>
-        <w:pStyle w:val="ListNumber"/>
-      </w:pPr>
-      <w:r>
-        <w:rPr>
-          <w:b/>
-        </w:rPr>
-        <w:t>Prepara el campo</w:t>
-      </w:r>
-      <w:r>
-        <w:rPr/>
-        <w:t xml:space="preserve"> (miércoles 14): lee </w:t>
-      </w:r>
-      <w:r>
-        <w:rPr>
-          <w:rFonts w:ascii="Consolas" w:hAnsi="Consolas" w:cs="Consolas" w:eastAsia="Consolas"/>
-          <w:color w:val="0B1F3A"/>
-          <w:sz w:val="19"/>
-        </w:rPr>
-        <w:t>04_Instrumentos/2026-10-11_P2_Protocolo_Cronometraje_v0.1.md</w:t>
-      </w:r>
-      <w:r>
-        <w:rPr/>
-        <w:t xml:space="preserve"> y </w:t>
-      </w:r>
-      <w:r>
-        <w:rPr>
-          <w:rFonts w:ascii="Consolas" w:hAnsi="Consolas" w:cs="Consolas" w:eastAsia="Consolas"/>
-          <w:color w:val="0B1F3A"/>
-          <w:sz w:val="19"/>
-        </w:rPr>
-        <w:t>2026-10-11_P1_Protocolo_Aplicacion_Procedencia_v0.1.md</w:t>
-      </w:r>
-      <w:r>
-        <w:rPr/>
-        <w:t>, e imprime las hojas de cronometraje.</w:t>
-      </w:r>
-    </w:p>
-    <w:p>
-      <w:pPr>
-        <w:pStyle w:val="ListNumber"/>
-      </w:pPr>
-      <w:r>
-        <w:rPr>
-          <w:b/>
-        </w:rPr>
-        <w:t>Campo</w:t>
-      </w:r>
-      <w:r>
-        <w:rPr/>
-        <w:t xml:space="preserve"> (jueves 15 y viernes 16): cronometraje P2-A, muestra documental P2-B y apoyo en I2 (clientes). Llena el registro P1 en cada aplicación.</w:t>
-      </w:r>
-    </w:p>
-    <w:p>
-      <w:pPr>
-        <w:pStyle w:val="ListNumber"/>
-      </w:pPr>
-      <w:r>
-        <w:rPr>
-          <w:b/>
-        </w:rPr>
-        <w:t>Fin de semana:</w:t>
-      </w:r>
-      <w:r>
-        <w:rPr/>
-        <w:t xml:space="preserve"> tabulación con Víctor. Los datos </w:t>
-      </w:r>
-      <w:r>
-        <w:rPr>
-          <w:b/>
-        </w:rPr>
-        <w:t>crudos</w:t>
-      </w:r>
-      <w:r>
-        <w:rPr/>
-        <w:t xml:space="preserve"> van a </w:t>
-      </w:r>
-      <w:r>
-        <w:rPr>
-          <w:rFonts w:ascii="Consolas" w:hAnsi="Consolas" w:cs="Consolas" w:eastAsia="Consolas"/>
-          <w:color w:val="0B1F3A"/>
-          <w:sz w:val="19"/>
-        </w:rPr>
-        <w:t>_crudo/</w:t>
-      </w:r>
-      <w:r>
-        <w:rPr/>
-        <w:t>; al repo solo suben los anonimizados, y antes de subir corres la auditoría.</w:t>
-      </w:r>
-    </w:p>
-    <w:p>
-      <w:pPr>
-        <w:pStyle w:val="ListNumber"/>
-      </w:pPr>
-      <w:r>
-        <w:rPr>
-          <w:b/>
-        </w:rPr>
-        <w:t>Análisis de la bóveda 1</w:t>
-      </w:r>
-      <w:r>
-        <w:rPr/>
-        <w:t xml:space="preserve"> (#11): Víctor te comparte una copia de lectura de </w:t>
-      </w:r>
-      <w:r>
-        <w:rPr>
-          <w:rFonts w:ascii="Consolas" w:hAnsi="Consolas" w:cs="Consolas" w:eastAsia="Consolas"/>
-          <w:color w:val="0B1F3A"/>
-          <w:sz w:val="19"/>
-        </w:rPr>
-        <w:t>99_Sistema/</w:t>
-      </w:r>
-      <w:r>
-        <w:rPr/>
-        <w:t xml:space="preserve"> de su Segundo Cerebro (sin las carpetas CRISFE). Anota en </w:t>
-      </w:r>
-      <w:r>
-        <w:rPr>
-          <w:rFonts w:ascii="Consolas" w:hAnsi="Consolas" w:cs="Consolas" w:eastAsia="Consolas"/>
-          <w:color w:val="0B1F3A"/>
-          <w:sz w:val="19"/>
-        </w:rPr>
-        <w:t>07_Flujos_Diseno/ideas_boveda1.md</w:t>
-      </w:r>
-      <w:r>
-        <w:rPr/>
-        <w:t xml:space="preserve"> qué patrones reutilizar:</w:t>
-      </w:r>
-    </w:p>
-    <w:p>
-      <w:pPr>
-        <w:pStyle w:val="ListBullet"/>
-        <w:ind w:left="714"/>
-      </w:pPr>
-      <w:r>
-        <w:rPr/>
-        <w:t>ingestor con watchdog;</w:t>
-      </w:r>
-    </w:p>
-    <w:p>
-      <w:pPr>
-        <w:pStyle w:val="ListBullet"/>
-        <w:ind w:left="714"/>
-      </w:pPr>
-      <w:r>
-        <w:rPr/>
-        <w:t>enlazador de wikilinks;</w:t>
-      </w:r>
-    </w:p>
-    <w:p>
-      <w:pPr>
-        <w:pStyle w:val="ListBullet"/>
-        <w:ind w:left="714"/>
-      </w:pPr>
-      <w:r>
-        <w:rPr/>
-        <w:t>RAG con exclusiones;</w:t>
-      </w:r>
-    </w:p>
-    <w:p>
-      <w:pPr>
-        <w:pStyle w:val="ListBullet"/>
-        <w:ind w:left="714"/>
-      </w:pPr>
-      <w:r>
-        <w:rPr/>
-        <w:t>plantillas con frontmatter.</w:t>
-      </w:r>
-    </w:p>
-    <w:p>
-      <w:pPr>
-        <w:pStyle w:val="Heading1"/>
-        <w:pBdr>
-          <w:bottom w:val="single" w:sz="10" w:space="4" w:color="B87333"/>
-        </w:pBdr>
-      </w:pPr>
-      <w:r>
-        <w:t>4. Tus tareas por semana</w:t>
+        <w:t>3. Tu primera semana (12–18 oct): investigar con fuentes</w:t>
       </w:r>
     </w:p>
     <w:p>
       <w:r>
         <w:rPr/>
-        <w:t xml:space="preserve">Cada tarea es un issue. Ciérralo con </w:t>
-      </w:r>
-      <w:r>
-        <w:rPr>
-          <w:rFonts w:ascii="Consolas" w:hAnsi="Consolas" w:cs="Consolas" w:eastAsia="Consolas"/>
-          <w:color w:val="0B1F3A"/>
-          <w:sz w:val="19"/>
-        </w:rPr>
-        <w:t>closes #n</w:t>
-      </w:r>
-      <w:r>
-        <w:rPr/>
-        <w:t xml:space="preserve"> en el commit; Víctor marca el </w:t>
-      </w:r>
-      <w:r>
-        <w:rPr>
-          <w:rFonts w:ascii="Consolas" w:hAnsi="Consolas" w:cs="Consolas" w:eastAsia="Consolas"/>
-          <w:color w:val="0B1F3A"/>
-          <w:sz w:val="19"/>
-        </w:rPr>
-        <w:t>[x]</w:t>
-      </w:r>
-      <w:r>
-        <w:rPr/>
-        <w:t xml:space="preserve"> en el cronograma, o lo hace el script de sincronización.</w:t>
+        <w:t>Esta semana investigas, igual que Víctor: buscas estudios y documentos, los lees y llenas una ficha por cada fuente.</w:t>
       </w:r>
     </w:p>
     <w:tbl>
@@ -1001,14 +563,15 @@
         </w:tblBorders>
       </w:tblPr>
       <w:tblGrid>
-        <w:gridCol w:w="3249"/>
-        <w:gridCol w:w="3249"/>
-        <w:gridCol w:w="3249"/>
+        <w:gridCol w:w="2436"/>
+        <w:gridCol w:w="2436"/>
+        <w:gridCol w:w="2436"/>
+        <w:gridCol w:w="2436"/>
       </w:tblGrid>
       <w:tr>
         <w:tc>
           <w:tcPr>
-            <w:tcW w:type="dxa" w:w="3249"/>
+            <w:tcW w:type="dxa" w:w="2436"/>
             <w:shd w:val="clear" w:color="auto" w:fill="0B1F3A"/>
           </w:tcPr>
           <w:p>
@@ -1023,13 +586,13 @@
                 <w:color w:val="FFFFFF"/>
                 <w:sz w:val="19"/>
               </w:rPr>
-              <w:t>Semana</w:t>
+              <w:t>Día</w:t>
             </w:r>
           </w:p>
         </w:tc>
         <w:tc>
           <w:tcPr>
-            <w:tcW w:type="dxa" w:w="3249"/>
+            <w:tcW w:type="dxa" w:w="2436"/>
             <w:shd w:val="clear" w:color="auto" w:fill="0B1F3A"/>
           </w:tcPr>
           <w:p>
@@ -1044,13 +607,13 @@
                 <w:color w:val="FFFFFF"/>
                 <w:sz w:val="19"/>
               </w:rPr>
-              <w:t>Tarea</w:t>
+              <w:t>Qué haces</w:t>
             </w:r>
           </w:p>
         </w:tc>
         <w:tc>
           <w:tcPr>
-            <w:tcW w:type="dxa" w:w="3249"/>
+            <w:tcW w:type="dxa" w:w="2436"/>
             <w:shd w:val="clear" w:color="auto" w:fill="0B1F3A"/>
           </w:tcPr>
           <w:p>
@@ -1065,7 +628,28 @@
                 <w:color w:val="FFFFFF"/>
                 <w:sz w:val="19"/>
               </w:rPr>
-              <w:t>Issue</w:t>
+              <w:t>Dónde</w:t>
+            </w:r>
+          </w:p>
+        </w:tc>
+        <w:tc>
+          <w:tcPr>
+            <w:tcW w:type="dxa" w:w="2436"/>
+            <w:shd w:val="clear" w:color="auto" w:fill="0B1F3A"/>
+          </w:tcPr>
+          <w:p>
+            <w:pPr>
+              <w:spacing w:after="20"/>
+            </w:pPr>
+            <w:r/>
+            <w:r>
+              <w:rPr>
+                <w:rFonts w:ascii="Poppins" w:hAnsi="Poppins" w:cs="Poppins" w:eastAsia="Poppins"/>
+                <w:b/>
+                <w:color w:val="FFFFFF"/>
+                <w:sz w:val="19"/>
+              </w:rPr>
+              <w:t>Tiempo</w:t>
             </w:r>
           </w:p>
         </w:tc>
@@ -1073,7 +657,7 @@
       <w:tr>
         <w:tc>
           <w:tcPr>
-            <w:tcW w:type="dxa" w:w="3249"/>
+            <w:tcW w:type="dxa" w:w="2436"/>
           </w:tcPr>
           <w:p>
             <w:pPr>
@@ -1088,13 +672,13 @@
               <w:rPr>
                 <w:sz w:val="19"/>
               </w:rPr>
-              <w:t>S1 · 12–18 oct</w:t>
+              <w:t>Lun 12</w:t>
             </w:r>
           </w:p>
         </w:tc>
         <w:tc>
           <w:tcPr>
-            <w:tcW w:type="dxa" w:w="3249"/>
+            <w:tcW w:type="dxa" w:w="2436"/>
           </w:tcPr>
           <w:p>
             <w:pPr>
@@ -1109,13 +693,13 @@
               <w:rPr>
                 <w:sz w:val="19"/>
               </w:rPr>
-              <w:t>Campo: I2 clientes + cronometraje P2-A + muestra P2-B</w:t>
+              <w:t>Aceptar la invitación de GitHub y clonar el repo</w:t>
             </w:r>
           </w:p>
         </w:tc>
         <w:tc>
           <w:tcPr>
-            <w:tcW w:type="dxa" w:w="3249"/>
+            <w:tcW w:type="dxa" w:w="2436"/>
           </w:tcPr>
           <w:p>
             <w:pPr>
@@ -1126,23 +710,17 @@
                 <w:sz w:val="19"/>
               </w:rPr>
             </w:r>
-            <w:hyperlink r:id="rId11">
-              <w:r>
-                <w:rPr>
-                  <w:color w:val="B87333"/>
-                  <w:u w:val="single"/>
-                </w:rPr>
-                <w:t xml:space="preserve">#9</w:t>
-              </w:r>
-            </w:hyperlink>
+            <w:r>
+              <w:rPr>
+                <w:sz w:val="19"/>
+              </w:rPr>
+              <w:t>Tu PC: sección 6 de esta guía</w:t>
+            </w:r>
           </w:p>
         </w:tc>
-      </w:tr>
-      <w:tr>
         <w:tc>
           <w:tcPr>
-            <w:tcW w:type="dxa" w:w="3249"/>
-            <w:shd w:val="clear" w:color="auto" w:fill="EEF2F7"/>
+            <w:tcW w:type="dxa" w:w="2436"/>
           </w:tcPr>
           <w:p>
             <w:pPr>
@@ -1153,11 +731,19 @@
                 <w:sz w:val="19"/>
               </w:rPr>
             </w:r>
+            <w:r>
+              <w:rPr>
+                <w:sz w:val="19"/>
+              </w:rPr>
+              <w:t>1 h</w:t>
+            </w:r>
           </w:p>
         </w:tc>
+      </w:tr>
+      <w:tr>
         <w:tc>
           <w:tcPr>
-            <w:tcW w:type="dxa" w:w="3249"/>
+            <w:tcW w:type="dxa" w:w="2436"/>
             <w:shd w:val="clear" w:color="auto" w:fill="EEF2F7"/>
           </w:tcPr>
           <w:p>
@@ -1173,118 +759,13 @@
               <w:rPr>
                 <w:sz w:val="19"/>
               </w:rPr>
-              <w:t>Aceptar la invitación, clonar y levantar el RAG</w:t>
+              <w:t>Lun 12</w:t>
             </w:r>
           </w:p>
         </w:tc>
         <w:tc>
           <w:tcPr>
-            <w:tcW w:type="dxa" w:w="3249"/>
-            <w:shd w:val="clear" w:color="auto" w:fill="EEF2F7"/>
-          </w:tcPr>
-          <w:p>
-            <w:pPr>
-              <w:spacing w:after="20"/>
-            </w:pPr>
-            <w:r>
-              <w:rPr>
-                <w:sz w:val="19"/>
-              </w:rPr>
-            </w:r>
-            <w:hyperlink r:id="rId12">
-              <w:r>
-                <w:rPr>
-                  <w:color w:val="B87333"/>
-                  <w:u w:val="single"/>
-                </w:rPr>
-                <w:t xml:space="preserve">#10</w:t>
-              </w:r>
-            </w:hyperlink>
-          </w:p>
-        </w:tc>
-      </w:tr>
-      <w:tr>
-        <w:tc>
-          <w:tcPr>
-            <w:tcW w:type="dxa" w:w="3249"/>
-          </w:tcPr>
-          <w:p>
-            <w:pPr>
-              <w:spacing w:after="20"/>
-            </w:pPr>
-            <w:r>
-              <w:rPr>
-                <w:sz w:val="19"/>
-              </w:rPr>
-            </w:r>
-          </w:p>
-        </w:tc>
-        <w:tc>
-          <w:tcPr>
-            <w:tcW w:type="dxa" w:w="3249"/>
-          </w:tcPr>
-          <w:p>
-            <w:pPr>
-              <w:spacing w:after="20"/>
-            </w:pPr>
-            <w:r>
-              <w:rPr>
-                <w:sz w:val="19"/>
-              </w:rPr>
-            </w:r>
-            <w:r>
-              <w:rPr>
-                <w:sz w:val="19"/>
-              </w:rPr>
-              <w:t>Analizar la bóveda 1 y extraer ideas</w:t>
-            </w:r>
-          </w:p>
-        </w:tc>
-        <w:tc>
-          <w:tcPr>
-            <w:tcW w:type="dxa" w:w="3249"/>
-          </w:tcPr>
-          <w:p>
-            <w:pPr>
-              <w:spacing w:after="20"/>
-            </w:pPr>
-            <w:r>
-              <w:rPr>
-                <w:sz w:val="19"/>
-              </w:rPr>
-            </w:r>
-            <w:hyperlink r:id="rId13">
-              <w:r>
-                <w:rPr>
-                  <w:color w:val="B87333"/>
-                  <w:u w:val="single"/>
-                </w:rPr>
-                <w:t xml:space="preserve">#11</w:t>
-              </w:r>
-            </w:hyperlink>
-          </w:p>
-        </w:tc>
-      </w:tr>
-      <w:tr>
-        <w:tc>
-          <w:tcPr>
-            <w:tcW w:type="dxa" w:w="3249"/>
-            <w:shd w:val="clear" w:color="auto" w:fill="EEF2F7"/>
-          </w:tcPr>
-          <w:p>
-            <w:pPr>
-              <w:spacing w:after="20"/>
-            </w:pPr>
-            <w:r>
-              <w:rPr>
-                <w:sz w:val="19"/>
-              </w:rPr>
-            </w:r>
-          </w:p>
-        </w:tc>
-        <w:tc>
-          <w:tcPr>
-            <w:tcW w:type="dxa" w:w="3249"/>
+            <w:tcW w:type="dxa" w:w="2436"/>
             <w:shd w:val="clear" w:color="auto" w:fill="EEF2F7"/>
           </w:tcPr>
           <w:p>
@@ -1300,124 +781,13 @@
               <w:rPr>
                 <w:sz w:val="19"/>
               </w:rPr>
-              <w:t>Tabulación y consolidación (con Víctor)</w:t>
+              <w:t>Levantar el buscador RAG (búsqueda con IA en las notas)</w:t>
             </w:r>
           </w:p>
         </w:tc>
         <w:tc>
           <w:tcPr>
-            <w:tcW w:type="dxa" w:w="3249"/>
-            <w:shd w:val="clear" w:color="auto" w:fill="EEF2F7"/>
-          </w:tcPr>
-          <w:p>
-            <w:pPr>
-              <w:spacing w:after="20"/>
-            </w:pPr>
-            <w:r>
-              <w:rPr>
-                <w:sz w:val="19"/>
-              </w:rPr>
-            </w:r>
-            <w:hyperlink r:id="rId14">
-              <w:r>
-                <w:rPr>
-                  <w:color w:val="B87333"/>
-                  <w:u w:val="single"/>
-                </w:rPr>
-                <w:t xml:space="preserve">#12</w:t>
-              </w:r>
-            </w:hyperlink>
-          </w:p>
-        </w:tc>
-      </w:tr>
-      <w:tr>
-        <w:tc>
-          <w:tcPr>
-            <w:tcW w:type="dxa" w:w="3249"/>
-          </w:tcPr>
-          <w:p>
-            <w:pPr>
-              <w:spacing w:after="20"/>
-            </w:pPr>
-            <w:r>
-              <w:rPr>
-                <w:sz w:val="19"/>
-              </w:rPr>
-            </w:r>
-            <w:r>
-              <w:rPr>
-                <w:sz w:val="19"/>
-              </w:rPr>
-              <w:t>S2 · 19–25 oct</w:t>
-            </w:r>
-          </w:p>
-        </w:tc>
-        <w:tc>
-          <w:tcPr>
-            <w:tcW w:type="dxa" w:w="3249"/>
-          </w:tcPr>
-          <w:p>
-            <w:pPr>
-              <w:spacing w:after="20"/>
-            </w:pPr>
-            <w:r>
-              <w:rPr>
-                <w:sz w:val="19"/>
-              </w:rPr>
-            </w:r>
-            <w:r>
-              <w:rPr>
-                <w:sz w:val="19"/>
-              </w:rPr>
-              <w:t>Análisis descriptivo de los datos de campo</w:t>
-            </w:r>
-          </w:p>
-        </w:tc>
-        <w:tc>
-          <w:tcPr>
-            <w:tcW w:type="dxa" w:w="3249"/>
-          </w:tcPr>
-          <w:p>
-            <w:pPr>
-              <w:spacing w:after="20"/>
-            </w:pPr>
-            <w:r>
-              <w:rPr>
-                <w:sz w:val="19"/>
-              </w:rPr>
-            </w:r>
-            <w:hyperlink r:id="rId15">
-              <w:r>
-                <w:rPr>
-                  <w:color w:val="B87333"/>
-                  <w:u w:val="single"/>
-                </w:rPr>
-                <w:t xml:space="preserve">#16</w:t>
-              </w:r>
-            </w:hyperlink>
-          </w:p>
-        </w:tc>
-      </w:tr>
-      <w:tr>
-        <w:tc>
-          <w:tcPr>
-            <w:tcW w:type="dxa" w:w="3249"/>
-            <w:shd w:val="clear" w:color="auto" w:fill="EEF2F7"/>
-          </w:tcPr>
-          <w:p>
-            <w:pPr>
-              <w:spacing w:after="20"/>
-            </w:pPr>
-            <w:r>
-              <w:rPr>
-                <w:sz w:val="19"/>
-              </w:rPr>
-            </w:r>
-          </w:p>
-        </w:tc>
-        <w:tc>
-          <w:tcPr>
-            <w:tcW w:type="dxa" w:w="3249"/>
+            <w:tcW w:type="dxa" w:w="2436"/>
             <w:shd w:val="clear" w:color="auto" w:fill="EEF2F7"/>
           </w:tcPr>
           <w:p>
@@ -1433,102 +803,21 @@
               <w:rPr>
                 <w:sz w:val="19"/>
               </w:rPr>
-              <w:t>Mapa del proceso AS-IS (BPMN)</w:t>
+              <w:t xml:space="preserve">Tu PC: </w:t>
+            </w:r>
+            <w:r>
+              <w:rPr>
+                <w:rFonts w:ascii="Consolas" w:hAnsi="Consolas" w:cs="Consolas" w:eastAsia="Consolas"/>
+                <w:color w:val="0B1F3A"/>
+                <w:sz w:val="19"/>
+              </w:rPr>
+              <w:t>RAG_README.md</w:t>
             </w:r>
           </w:p>
         </w:tc>
         <w:tc>
           <w:tcPr>
-            <w:tcW w:type="dxa" w:w="3249"/>
-            <w:shd w:val="clear" w:color="auto" w:fill="EEF2F7"/>
-          </w:tcPr>
-          <w:p>
-            <w:pPr>
-              <w:spacing w:after="20"/>
-            </w:pPr>
-            <w:r>
-              <w:rPr>
-                <w:sz w:val="19"/>
-              </w:rPr>
-            </w:r>
-            <w:hyperlink r:id="rId16">
-              <w:r>
-                <w:rPr>
-                  <w:color w:val="B87333"/>
-                  <w:u w:val="single"/>
-                </w:rPr>
-                <w:t xml:space="preserve">#17</w:t>
-              </w:r>
-            </w:hyperlink>
-          </w:p>
-        </w:tc>
-      </w:tr>
-      <w:tr>
-        <w:tc>
-          <w:tcPr>
-            <w:tcW w:type="dxa" w:w="3249"/>
-          </w:tcPr>
-          <w:p>
-            <w:pPr>
-              <w:spacing w:after="20"/>
-            </w:pPr>
-            <w:r>
-              <w:rPr>
-                <w:sz w:val="19"/>
-              </w:rPr>
-            </w:r>
-          </w:p>
-        </w:tc>
-        <w:tc>
-          <w:tcPr>
-            <w:tcW w:type="dxa" w:w="3249"/>
-          </w:tcPr>
-          <w:p>
-            <w:pPr>
-              <w:spacing w:after="20"/>
-            </w:pPr>
-            <w:r>
-              <w:rPr>
-                <w:sz w:val="19"/>
-              </w:rPr>
-            </w:r>
-            <w:r>
-              <w:rPr>
-                <w:sz w:val="19"/>
-              </w:rPr>
-              <w:t>Inventario de herramientas candidatas con criterios</w:t>
-            </w:r>
-          </w:p>
-        </w:tc>
-        <w:tc>
-          <w:tcPr>
-            <w:tcW w:type="dxa" w:w="3249"/>
-          </w:tcPr>
-          <w:p>
-            <w:pPr>
-              <w:spacing w:after="20"/>
-            </w:pPr>
-            <w:r>
-              <w:rPr>
-                <w:sz w:val="19"/>
-              </w:rPr>
-            </w:r>
-            <w:hyperlink r:id="rId17">
-              <w:r>
-                <w:rPr>
-                  <w:color w:val="B87333"/>
-                  <w:u w:val="single"/>
-                </w:rPr>
-                <w:t xml:space="preserve">#18</w:t>
-              </w:r>
-            </w:hyperlink>
-          </w:p>
-        </w:tc>
-      </w:tr>
-      <w:tr>
-        <w:tc>
-          <w:tcPr>
-            <w:tcW w:type="dxa" w:w="3249"/>
+            <w:tcW w:type="dxa" w:w="2436"/>
             <w:shd w:val="clear" w:color="auto" w:fill="EEF2F7"/>
           </w:tcPr>
           <w:p>
@@ -1544,13 +833,116 @@
               <w:rPr>
                 <w:sz w:val="19"/>
               </w:rPr>
-              <w:t>S3 · 26–30 oct</w:t>
+              <w:t>1 h</w:t>
+            </w:r>
+          </w:p>
+        </w:tc>
+      </w:tr>
+      <w:tr>
+        <w:tc>
+          <w:tcPr>
+            <w:tcW w:type="dxa" w:w="2436"/>
+          </w:tcPr>
+          <w:p>
+            <w:pPr>
+              <w:spacing w:after="20"/>
+            </w:pPr>
+            <w:r>
+              <w:rPr>
+                <w:sz w:val="19"/>
+              </w:rPr>
+            </w:r>
+            <w:r>
+              <w:rPr>
+                <w:sz w:val="19"/>
+              </w:rPr>
+              <w:t>Mar 13</w:t>
             </w:r>
           </w:p>
         </w:tc>
         <w:tc>
           <w:tcPr>
-            <w:tcW w:type="dxa" w:w="3249"/>
+            <w:tcW w:type="dxa" w:w="2436"/>
+          </w:tcPr>
+          <w:p>
+            <w:pPr>
+              <w:spacing w:after="20"/>
+            </w:pPr>
+            <w:r>
+              <w:rPr>
+                <w:sz w:val="19"/>
+              </w:rPr>
+            </w:r>
+            <w:r>
+              <w:rPr>
+                <w:sz w:val="19"/>
+              </w:rPr>
+              <w:t xml:space="preserve">Investigar </w:t>
+            </w:r>
+            <w:r>
+              <w:rPr>
+                <w:b/>
+                <w:sz w:val="19"/>
+              </w:rPr>
+              <w:t>cómo consolidar bóvedas de conocimiento</w:t>
+            </w:r>
+            <w:r>
+              <w:rPr>
+                <w:sz w:val="19"/>
+              </w:rPr>
+              <w:t xml:space="preserve"> (≥5 fuentes)</w:t>
+            </w:r>
+          </w:p>
+        </w:tc>
+        <w:tc>
+          <w:tcPr>
+            <w:tcW w:type="dxa" w:w="2436"/>
+          </w:tcPr>
+          <w:p>
+            <w:pPr>
+              <w:spacing w:after="20"/>
+            </w:pPr>
+            <w:r>
+              <w:rPr>
+                <w:sz w:val="19"/>
+              </w:rPr>
+            </w:r>
+            <w:r>
+              <w:rPr>
+                <w:rFonts w:ascii="Consolas" w:hAnsi="Consolas" w:cs="Consolas" w:eastAsia="Consolas"/>
+                <w:color w:val="0B1F3A"/>
+                <w:sz w:val="19"/>
+              </w:rPr>
+              <w:t>02_Fuentes/Tecnologia_IA/</w:t>
+            </w:r>
+          </w:p>
+        </w:tc>
+        <w:tc>
+          <w:tcPr>
+            <w:tcW w:type="dxa" w:w="2436"/>
+          </w:tcPr>
+          <w:p>
+            <w:pPr>
+              <w:spacing w:after="20"/>
+            </w:pPr>
+            <w:r>
+              <w:rPr>
+                <w:sz w:val="19"/>
+              </w:rPr>
+            </w:r>
+            <w:r>
+              <w:rPr>
+                <w:sz w:val="19"/>
+              </w:rPr>
+              <w:t>1,5 h</w:t>
+            </w:r>
+          </w:p>
+        </w:tc>
+      </w:tr>
+      <w:tr>
+        <w:tc>
+          <w:tcPr>
+            <w:tcW w:type="dxa" w:w="2436"/>
             <w:shd w:val="clear" w:color="auto" w:fill="EEF2F7"/>
           </w:tcPr>
           <w:p>
@@ -1566,124 +958,13 @@
               <w:rPr>
                 <w:sz w:val="19"/>
               </w:rPr>
-              <w:t>AS-IS y datos listos para la Revisión 1</w:t>
+              <w:t>Mar 13</w:t>
             </w:r>
           </w:p>
         </w:tc>
         <w:tc>
           <w:tcPr>
-            <w:tcW w:type="dxa" w:w="3249"/>
-            <w:shd w:val="clear" w:color="auto" w:fill="EEF2F7"/>
-          </w:tcPr>
-          <w:p>
-            <w:pPr>
-              <w:spacing w:after="20"/>
-            </w:pPr>
-            <w:r>
-              <w:rPr>
-                <w:sz w:val="19"/>
-              </w:rPr>
-            </w:r>
-            <w:hyperlink r:id="rId18">
-              <w:r>
-                <w:rPr>
-                  <w:color w:val="B87333"/>
-                  <w:u w:val="single"/>
-                </w:rPr>
-                <w:t xml:space="preserve">#21</w:t>
-              </w:r>
-            </w:hyperlink>
-          </w:p>
-        </w:tc>
-      </w:tr>
-      <w:tr>
-        <w:tc>
-          <w:tcPr>
-            <w:tcW w:type="dxa" w:w="3249"/>
-          </w:tcPr>
-          <w:p>
-            <w:pPr>
-              <w:spacing w:after="20"/>
-            </w:pPr>
-            <w:r>
-              <w:rPr>
-                <w:sz w:val="19"/>
-              </w:rPr>
-            </w:r>
-            <w:r>
-              <w:rPr>
-                <w:sz w:val="19"/>
-              </w:rPr>
-              <w:t>S4 · 2–8 nov</w:t>
-            </w:r>
-          </w:p>
-        </w:tc>
-        <w:tc>
-          <w:tcPr>
-            <w:tcW w:type="dxa" w:w="3249"/>
-          </w:tcPr>
-          <w:p>
-            <w:pPr>
-              <w:spacing w:after="20"/>
-            </w:pPr>
-            <w:r>
-              <w:rPr>
-                <w:sz w:val="19"/>
-              </w:rPr>
-            </w:r>
-            <w:r>
-              <w:rPr>
-                <w:sz w:val="19"/>
-              </w:rPr>
-              <w:t>Flujogramas TO-BE (2–4 nov)</w:t>
-            </w:r>
-          </w:p>
-        </w:tc>
-        <w:tc>
-          <w:tcPr>
-            <w:tcW w:type="dxa" w:w="3249"/>
-          </w:tcPr>
-          <w:p>
-            <w:pPr>
-              <w:spacing w:after="20"/>
-            </w:pPr>
-            <w:r>
-              <w:rPr>
-                <w:sz w:val="19"/>
-              </w:rPr>
-            </w:r>
-            <w:hyperlink r:id="rId19">
-              <w:r>
-                <w:rPr>
-                  <w:color w:val="B87333"/>
-                  <w:u w:val="single"/>
-                </w:rPr>
-                <w:t xml:space="preserve">#22</w:t>
-              </w:r>
-            </w:hyperlink>
-          </w:p>
-        </w:tc>
-      </w:tr>
-      <w:tr>
-        <w:tc>
-          <w:tcPr>
-            <w:tcW w:type="dxa" w:w="3249"/>
-            <w:shd w:val="clear" w:color="auto" w:fill="EEF2F7"/>
-          </w:tcPr>
-          <w:p>
-            <w:pPr>
-              <w:spacing w:after="20"/>
-            </w:pPr>
-            <w:r>
-              <w:rPr>
-                <w:sz w:val="19"/>
-              </w:rPr>
-            </w:r>
-          </w:p>
-        </w:tc>
-        <w:tc>
-          <w:tcPr>
-            <w:tcW w:type="dxa" w:w="3249"/>
+            <w:tcW w:type="dxa" w:w="2436"/>
             <w:shd w:val="clear" w:color="auto" w:fill="EEF2F7"/>
           </w:tcPr>
           <w:p>
@@ -1699,40 +980,14 @@
               <w:rPr>
                 <w:sz w:val="19"/>
               </w:rPr>
-              <w:t>Levantar la bóveda del sistema desde los flujos aprobados (5–8 nov)</w:t>
+              <w:t>Leer el Documento madre y el Glosario</w:t>
             </w:r>
           </w:p>
         </w:tc>
         <w:tc>
           <w:tcPr>
-            <w:tcW w:type="dxa" w:w="3249"/>
+            <w:tcW w:type="dxa" w:w="2436"/>
             <w:shd w:val="clear" w:color="auto" w:fill="EEF2F7"/>
-          </w:tcPr>
-          <w:p>
-            <w:pPr>
-              <w:spacing w:after="20"/>
-            </w:pPr>
-            <w:r>
-              <w:rPr>
-                <w:sz w:val="19"/>
-              </w:rPr>
-            </w:r>
-            <w:hyperlink r:id="rId20">
-              <w:r>
-                <w:rPr>
-                  <w:color w:val="B87333"/>
-                  <w:u w:val="single"/>
-                </w:rPr>
-                <w:t xml:space="preserve">#24</w:t>
-              </w:r>
-            </w:hyperlink>
-          </w:p>
-        </w:tc>
-      </w:tr>
-      <w:tr>
-        <w:tc>
-          <w:tcPr>
-            <w:tcW w:type="dxa" w:w="3249"/>
           </w:tcPr>
           <w:p>
             <w:pPr>
@@ -1745,78 +1000,37 @@
             </w:r>
             <w:r>
               <w:rPr>
+                <w:rFonts w:ascii="Consolas" w:hAnsi="Consolas" w:cs="Consolas" w:eastAsia="Consolas"/>
+                <w:color w:val="0B1F3A"/>
                 <w:sz w:val="19"/>
               </w:rPr>
-              <w:t>S5 · 9–15 nov</w:t>
+              <w:t>00_DOCUMENTO_MADRE.pdf</w:t>
+            </w:r>
+            <w:r>
+              <w:rPr>
+                <w:sz w:val="19"/>
+              </w:rPr>
+              <w:t xml:space="preserve"> y </w:t>
+            </w:r>
+            <w:r>
+              <w:rPr>
+                <w:rFonts w:ascii="Consolas" w:hAnsi="Consolas" w:cs="Consolas" w:eastAsia="Consolas"/>
+                <w:color w:val="0B1F3A"/>
+                <w:sz w:val="19"/>
+              </w:rPr>
+              <w:t>Glosario.pdf</w:t>
+            </w:r>
+            <w:r>
+              <w:rPr>
+                <w:sz w:val="19"/>
+              </w:rPr>
+              <w:t xml:space="preserve"> (raíz)</w:t>
             </w:r>
           </w:p>
         </w:tc>
         <w:tc>
           <w:tcPr>
-            <w:tcW w:type="dxa" w:w="3249"/>
-          </w:tcPr>
-          <w:p>
-            <w:pPr>
-              <w:spacing w:after="20"/>
-            </w:pPr>
-            <w:r>
-              <w:rPr>
-                <w:sz w:val="19"/>
-              </w:rPr>
-            </w:r>
-            <w:r>
-              <w:rPr>
-                <w:sz w:val="19"/>
-              </w:rPr>
-              <w:t>Prueba de concepto: front conversacional → back → bóveda</w:t>
-            </w:r>
-          </w:p>
-        </w:tc>
-        <w:tc>
-          <w:tcPr>
-            <w:tcW w:type="dxa" w:w="3249"/>
-          </w:tcPr>
-          <w:p>
-            <w:pPr>
-              <w:spacing w:after="20"/>
-            </w:pPr>
-            <w:r>
-              <w:rPr>
-                <w:sz w:val="19"/>
-              </w:rPr>
-            </w:r>
-            <w:hyperlink r:id="rId21">
-              <w:r>
-                <w:rPr>
-                  <w:color w:val="B87333"/>
-                  <w:u w:val="single"/>
-                </w:rPr>
-                <w:t xml:space="preserve">#31</w:t>
-              </w:r>
-            </w:hyperlink>
-          </w:p>
-        </w:tc>
-      </w:tr>
-      <w:tr>
-        <w:tc>
-          <w:tcPr>
-            <w:tcW w:type="dxa" w:w="3249"/>
-            <w:shd w:val="clear" w:color="auto" w:fill="EEF2F7"/>
-          </w:tcPr>
-          <w:p>
-            <w:pPr>
-              <w:spacing w:after="20"/>
-            </w:pPr>
-            <w:r>
-              <w:rPr>
-                <w:sz w:val="19"/>
-              </w:rPr>
-            </w:r>
-          </w:p>
-        </w:tc>
-        <w:tc>
-          <w:tcPr>
-            <w:tcW w:type="dxa" w:w="3249"/>
+            <w:tcW w:type="dxa" w:w="2436"/>
             <w:shd w:val="clear" w:color="auto" w:fill="EEF2F7"/>
           </w:tcPr>
           <w:p>
@@ -1832,40 +1046,15 @@
               <w:rPr>
                 <w:sz w:val="19"/>
               </w:rPr>
-              <w:t>Diseño de los 3 casos de prueba</w:t>
+              <w:t>0,5 h</w:t>
             </w:r>
-          </w:p>
-        </w:tc>
-        <w:tc>
-          <w:tcPr>
-            <w:tcW w:type="dxa" w:w="3249"/>
-            <w:shd w:val="clear" w:color="auto" w:fill="EEF2F7"/>
-          </w:tcPr>
-          <w:p>
-            <w:pPr>
-              <w:spacing w:after="20"/>
-            </w:pPr>
-            <w:r>
-              <w:rPr>
-                <w:sz w:val="19"/>
-              </w:rPr>
-            </w:r>
-            <w:hyperlink r:id="rId22">
-              <w:r>
-                <w:rPr>
-                  <w:color w:val="B87333"/>
-                  <w:u w:val="single"/>
-                </w:rPr>
-                <w:t xml:space="preserve">#32</w:t>
-              </w:r>
-            </w:hyperlink>
           </w:p>
         </w:tc>
       </w:tr>
       <w:tr>
         <w:tc>
           <w:tcPr>
-            <w:tcW w:type="dxa" w:w="3249"/>
+            <w:tcW w:type="dxa" w:w="2436"/>
           </w:tcPr>
           <w:p>
             <w:pPr>
@@ -1880,13 +1069,13 @@
               <w:rPr>
                 <w:sz w:val="19"/>
               </w:rPr>
-              <w:t>S6 · 16–22 nov</w:t>
+              <w:t>Mié 14</w:t>
             </w:r>
           </w:p>
         </w:tc>
         <w:tc>
           <w:tcPr>
-            <w:tcW w:type="dxa" w:w="3249"/>
+            <w:tcW w:type="dxa" w:w="2436"/>
           </w:tcPr>
           <w:p>
             <w:pPr>
@@ -1901,13 +1090,26 @@
               <w:rPr>
                 <w:sz w:val="19"/>
               </w:rPr>
-              <w:t>Revisión 2: presentar diseño, flujos y datos (con Víctor)</w:t>
+              <w:t xml:space="preserve">Investigar </w:t>
+            </w:r>
+            <w:r>
+              <w:rPr>
+                <w:b/>
+                <w:sz w:val="19"/>
+              </w:rPr>
+              <w:t>arquitecturas RAG para negocio</w:t>
+            </w:r>
+            <w:r>
+              <w:rPr>
+                <w:sz w:val="19"/>
+              </w:rPr>
+              <w:t xml:space="preserve"> (≥5 fuentes)</w:t>
             </w:r>
           </w:p>
         </w:tc>
         <w:tc>
           <w:tcPr>
-            <w:tcW w:type="dxa" w:w="3249"/>
+            <w:tcW w:type="dxa" w:w="2436"/>
           </w:tcPr>
           <w:p>
             <w:pPr>
@@ -1918,22 +1120,42 @@
                 <w:sz w:val="19"/>
               </w:rPr>
             </w:r>
-            <w:hyperlink r:id="rId23">
-              <w:r>
-                <w:rPr>
-                  <w:color w:val="B87333"/>
-                  <w:u w:val="single"/>
-                </w:rPr>
-                <w:t xml:space="preserve">#33</w:t>
-              </w:r>
-            </w:hyperlink>
+            <w:r>
+              <w:rPr>
+                <w:rFonts w:ascii="Consolas" w:hAnsi="Consolas" w:cs="Consolas" w:eastAsia="Consolas"/>
+                <w:color w:val="0B1F3A"/>
+                <w:sz w:val="19"/>
+              </w:rPr>
+              <w:t>02_Fuentes/Tecnologia_IA/</w:t>
+            </w:r>
+          </w:p>
+        </w:tc>
+        <w:tc>
+          <w:tcPr>
+            <w:tcW w:type="dxa" w:w="2436"/>
+          </w:tcPr>
+          <w:p>
+            <w:pPr>
+              <w:spacing w:after="20"/>
+            </w:pPr>
+            <w:r>
+              <w:rPr>
+                <w:sz w:val="19"/>
+              </w:rPr>
+            </w:r>
+            <w:r>
+              <w:rPr>
+                <w:sz w:val="19"/>
+              </w:rPr>
+              <w:t>1,5 h</w:t>
+            </w:r>
           </w:p>
         </w:tc>
       </w:tr>
       <w:tr>
         <w:tc>
           <w:tcPr>
-            <w:tcW w:type="dxa" w:w="3249"/>
+            <w:tcW w:type="dxa" w:w="2436"/>
             <w:shd w:val="clear" w:color="auto" w:fill="EEF2F7"/>
           </w:tcPr>
           <w:p>
@@ -1949,13 +1171,13 @@
               <w:rPr>
                 <w:sz w:val="19"/>
               </w:rPr>
-              <w:t>S7 · 23–29 nov</w:t>
+              <w:t>Mié 14</w:t>
             </w:r>
           </w:p>
         </w:tc>
         <w:tc>
           <w:tcPr>
-            <w:tcW w:type="dxa" w:w="3249"/>
+            <w:tcW w:type="dxa" w:w="2436"/>
             <w:shd w:val="clear" w:color="auto" w:fill="EEF2F7"/>
           </w:tcPr>
           <w:p>
@@ -1971,55 +1193,14 @@
               <w:rPr>
                 <w:sz w:val="19"/>
               </w:rPr>
-              <w:t>Incorporar observaciones (con Víctor) · arrancar la validación del diseño en operación experimental controlada el 24-nov</w:t>
+              <w:t>Escribir un resumen de 1 página para Víctor (bóvedas y RAG)</w:t>
             </w:r>
           </w:p>
         </w:tc>
         <w:tc>
           <w:tcPr>
-            <w:tcW w:type="dxa" w:w="3249"/>
+            <w:tcW w:type="dxa" w:w="2436"/>
             <w:shd w:val="clear" w:color="auto" w:fill="EEF2F7"/>
-          </w:tcPr>
-          <w:p>
-            <w:pPr>
-              <w:spacing w:after="20"/>
-            </w:pPr>
-            <w:r>
-              <w:rPr>
-                <w:sz w:val="19"/>
-              </w:rPr>
-            </w:r>
-            <w:hyperlink r:id="rId24">
-              <w:r>
-                <w:rPr>
-                  <w:color w:val="B87333"/>
-                  <w:u w:val="single"/>
-                </w:rPr>
-                <w:t xml:space="preserve">#35</w:t>
-              </w:r>
-            </w:hyperlink>
-            <w:r>
-              <w:rPr>
-                <w:sz w:val="19"/>
-              </w:rPr>
-              <w:t xml:space="preserve"> · </w:t>
-            </w:r>
-            <w:hyperlink r:id="rId25">
-              <w:r>
-                <w:rPr>
-                  <w:color w:val="B87333"/>
-                  <w:u w:val="single"/>
-                </w:rPr>
-                <w:t xml:space="preserve">#37</w:t>
-              </w:r>
-            </w:hyperlink>
-          </w:p>
-        </w:tc>
-      </w:tr>
-      <w:tr>
-        <w:tc>
-          <w:tcPr>
-            <w:tcW w:type="dxa" w:w="3249"/>
           </w:tcPr>
           <w:p>
             <w:pPr>
@@ -2032,122 +1213,17 @@
             </w:r>
             <w:r>
               <w:rPr>
+                <w:rFonts w:ascii="Consolas" w:hAnsi="Consolas" w:cs="Consolas" w:eastAsia="Consolas"/>
+                <w:color w:val="0B1F3A"/>
                 <w:sz w:val="19"/>
               </w:rPr>
-              <w:t>S8 · 30 nov–6 dic</w:t>
+              <w:t>02_Fuentes/Tecnologia_IA/2026-10-14_Resumen_Bovedas_RAG.md</w:t>
             </w:r>
           </w:p>
         </w:tc>
         <w:tc>
           <w:tcPr>
-            <w:tcW w:type="dxa" w:w="3249"/>
-          </w:tcPr>
-          <w:p>
-            <w:pPr>
-              <w:spacing w:after="20"/>
-            </w:pPr>
-            <w:r>
-              <w:rPr>
-                <w:sz w:val="19"/>
-              </w:rPr>
-            </w:r>
-            <w:r>
-              <w:rPr>
-                <w:sz w:val="19"/>
-              </w:rPr>
-              <w:t>Herramientas elegidas y descartadas · modelo de datos · plantillas + spec del asistente · casos de prueba · manual</w:t>
-            </w:r>
-          </w:p>
-        </w:tc>
-        <w:tc>
-          <w:tcPr>
-            <w:tcW w:type="dxa" w:w="3249"/>
-          </w:tcPr>
-          <w:p>
-            <w:pPr>
-              <w:spacing w:after="20"/>
-            </w:pPr>
-            <w:r>
-              <w:rPr>
-                <w:sz w:val="19"/>
-              </w:rPr>
-            </w:r>
-            <w:hyperlink r:id="rId26">
-              <w:r>
-                <w:rPr>
-                  <w:color w:val="B87333"/>
-                  <w:u w:val="single"/>
-                </w:rPr>
-                <w:t xml:space="preserve">#38</w:t>
-              </w:r>
-            </w:hyperlink>
-            <w:r>
-              <w:rPr>
-                <w:sz w:val="19"/>
-              </w:rPr>
-              <w:t xml:space="preserve"> · </w:t>
-            </w:r>
-            <w:hyperlink r:id="rId27">
-              <w:r>
-                <w:rPr>
-                  <w:color w:val="B87333"/>
-                  <w:u w:val="single"/>
-                </w:rPr>
-                <w:t xml:space="preserve">#39</w:t>
-              </w:r>
-            </w:hyperlink>
-            <w:r>
-              <w:rPr>
-                <w:sz w:val="19"/>
-              </w:rPr>
-              <w:t xml:space="preserve"> · </w:t>
-            </w:r>
-            <w:hyperlink r:id="rId28">
-              <w:r>
-                <w:rPr>
-                  <w:color w:val="B87333"/>
-                  <w:u w:val="single"/>
-                </w:rPr>
-                <w:t xml:space="preserve">#40</w:t>
-              </w:r>
-            </w:hyperlink>
-            <w:r>
-              <w:rPr>
-                <w:sz w:val="19"/>
-              </w:rPr>
-              <w:t xml:space="preserve"> · </w:t>
-            </w:r>
-            <w:hyperlink r:id="rId29">
-              <w:r>
-                <w:rPr>
-                  <w:color w:val="B87333"/>
-                  <w:u w:val="single"/>
-                </w:rPr>
-                <w:t xml:space="preserve">#41</w:t>
-              </w:r>
-            </w:hyperlink>
-            <w:r>
-              <w:rPr>
-                <w:sz w:val="19"/>
-              </w:rPr>
-              <w:t xml:space="preserve"> · </w:t>
-            </w:r>
-            <w:hyperlink r:id="rId30">
-              <w:r>
-                <w:rPr>
-                  <w:color w:val="B87333"/>
-                  <w:u w:val="single"/>
-                </w:rPr>
-                <w:t xml:space="preserve">#42</w:t>
-              </w:r>
-            </w:hyperlink>
-          </w:p>
-        </w:tc>
-      </w:tr>
-      <w:tr>
-        <w:tc>
-          <w:tcPr>
-            <w:tcW w:type="dxa" w:w="3249"/>
+            <w:tcW w:type="dxa" w:w="2436"/>
             <w:shd w:val="clear" w:color="auto" w:fill="EEF2F7"/>
           </w:tcPr>
           <w:p>
@@ -2163,13 +1239,114 @@
               <w:rPr>
                 <w:sz w:val="19"/>
               </w:rPr>
-              <w:t>S9 · 7–13 dic</w:t>
+              <w:t>0,5 h</w:t>
+            </w:r>
+          </w:p>
+        </w:tc>
+      </w:tr>
+      <w:tr>
+        <w:tc>
+          <w:tcPr>
+            <w:tcW w:type="dxa" w:w="2436"/>
+          </w:tcPr>
+          <w:p>
+            <w:pPr>
+              <w:spacing w:after="20"/>
+            </w:pPr>
+            <w:r>
+              <w:rPr>
+                <w:sz w:val="19"/>
+              </w:rPr>
+            </w:r>
+            <w:r>
+              <w:rPr>
+                <w:sz w:val="19"/>
+              </w:rPr>
+              <w:t>Jue 15</w:t>
             </w:r>
           </w:p>
         </w:tc>
         <w:tc>
           <w:tcPr>
-            <w:tcW w:type="dxa" w:w="3249"/>
+            <w:tcW w:type="dxa" w:w="2436"/>
+          </w:tcPr>
+          <w:p>
+            <w:pPr>
+              <w:spacing w:after="20"/>
+            </w:pPr>
+            <w:r>
+              <w:rPr>
+                <w:sz w:val="19"/>
+              </w:rPr>
+            </w:r>
+            <w:r>
+              <w:rPr>
+                <w:sz w:val="19"/>
+              </w:rPr>
+              <w:t>Cronometrar cotizaciones en Torvesa (</w:t>
+            </w:r>
+            <w:r>
+              <w:rPr>
+                <w:b/>
+                <w:sz w:val="19"/>
+              </w:rPr>
+              <w:t>solo si Torvesa autoriza</w:t>
+            </w:r>
+            <w:r>
+              <w:rPr>
+                <w:sz w:val="19"/>
+              </w:rPr>
+              <w:t>)</w:t>
+            </w:r>
+          </w:p>
+        </w:tc>
+        <w:tc>
+          <w:tcPr>
+            <w:tcW w:type="dxa" w:w="2436"/>
+          </w:tcPr>
+          <w:p>
+            <w:pPr>
+              <w:spacing w:after="20"/>
+            </w:pPr>
+            <w:r>
+              <w:rPr>
+                <w:sz w:val="19"/>
+              </w:rPr>
+            </w:r>
+            <w:r>
+              <w:rPr>
+                <w:sz w:val="19"/>
+              </w:rPr>
+              <w:t>Oficina de Torvesa</w:t>
+            </w:r>
+          </w:p>
+        </w:tc>
+        <w:tc>
+          <w:tcPr>
+            <w:tcW w:type="dxa" w:w="2436"/>
+          </w:tcPr>
+          <w:p>
+            <w:pPr>
+              <w:spacing w:after="20"/>
+            </w:pPr>
+            <w:r>
+              <w:rPr>
+                <w:sz w:val="19"/>
+              </w:rPr>
+            </w:r>
+            <w:r>
+              <w:rPr>
+                <w:sz w:val="19"/>
+              </w:rPr>
+              <w:t>2 h</w:t>
+            </w:r>
+          </w:p>
+        </w:tc>
+      </w:tr>
+      <w:tr>
+        <w:tc>
+          <w:tcPr>
+            <w:tcW w:type="dxa" w:w="2436"/>
             <w:shd w:val="clear" w:color="auto" w:fill="EEF2F7"/>
           </w:tcPr>
           <w:p>
@@ -2185,123 +1362,13 @@
               <w:rPr>
                 <w:sz w:val="19"/>
               </w:rPr>
-              <w:t>Medición post (con Víctor) · pruebas de uso y de carga</w:t>
+              <w:t>Vie 16</w:t>
             </w:r>
           </w:p>
         </w:tc>
         <w:tc>
           <w:tcPr>
-            <w:tcW w:type="dxa" w:w="3249"/>
-            <w:shd w:val="clear" w:color="auto" w:fill="EEF2F7"/>
-          </w:tcPr>
-          <w:p>
-            <w:pPr>
-              <w:spacing w:after="20"/>
-            </w:pPr>
-            <w:r>
-              <w:rPr>
-                <w:sz w:val="19"/>
-              </w:rPr>
-            </w:r>
-            <w:hyperlink r:id="rId31">
-              <w:r>
-                <w:rPr>
-                  <w:color w:val="B87333"/>
-                  <w:u w:val="single"/>
-                </w:rPr>
-                <w:t xml:space="preserve">#43</w:t>
-              </w:r>
-            </w:hyperlink>
-            <w:r>
-              <w:rPr>
-                <w:sz w:val="19"/>
-              </w:rPr>
-              <w:t xml:space="preserve"> · </w:t>
-            </w:r>
-            <w:hyperlink r:id="rId32">
-              <w:r>
-                <w:rPr>
-                  <w:color w:val="B87333"/>
-                  <w:u w:val="single"/>
-                </w:rPr>
-                <w:t xml:space="preserve">#45</w:t>
-              </w:r>
-            </w:hyperlink>
-          </w:p>
-        </w:tc>
-      </w:tr>
-      <w:tr>
-        <w:tc>
-          <w:tcPr>
-            <w:tcW w:type="dxa" w:w="3249"/>
-          </w:tcPr>
-          <w:p>
-            <w:pPr>
-              <w:spacing w:after="20"/>
-            </w:pPr>
-            <w:r>
-              <w:rPr>
-                <w:sz w:val="19"/>
-              </w:rPr>
-            </w:r>
-            <w:r>
-              <w:rPr>
-                <w:sz w:val="19"/>
-              </w:rPr>
-              <w:t>S10 · 14–20 dic</w:t>
-            </w:r>
-          </w:p>
-        </w:tc>
-        <w:tc>
-          <w:tcPr>
-            <w:tcW w:type="dxa" w:w="3249"/>
-          </w:tcPr>
-          <w:p>
-            <w:pPr>
-              <w:spacing w:after="20"/>
-            </w:pPr>
-            <w:r>
-              <w:rPr>
-                <w:sz w:val="19"/>
-              </w:rPr>
-            </w:r>
-            <w:r>
-              <w:rPr>
-                <w:sz w:val="19"/>
-              </w:rPr>
-              <w:t>Hito del 90 % (con Víctor)</w:t>
-            </w:r>
-          </w:p>
-        </w:tc>
-        <w:tc>
-          <w:tcPr>
-            <w:tcW w:type="dxa" w:w="3249"/>
-          </w:tcPr>
-          <w:p>
-            <w:pPr>
-              <w:spacing w:after="20"/>
-            </w:pPr>
-            <w:r>
-              <w:rPr>
-                <w:sz w:val="19"/>
-              </w:rPr>
-            </w:r>
-            <w:hyperlink r:id="rId33">
-              <w:r>
-                <w:rPr>
-                  <w:color w:val="B87333"/>
-                  <w:u w:val="single"/>
-                </w:rPr>
-                <w:t xml:space="preserve">#47</w:t>
-              </w:r>
-            </w:hyperlink>
-          </w:p>
-        </w:tc>
-      </w:tr>
-      <w:tr>
-        <w:tc>
-          <w:tcPr>
-            <w:tcW w:type="dxa" w:w="3249"/>
+            <w:tcW w:type="dxa" w:w="2436"/>
             <w:shd w:val="clear" w:color="auto" w:fill="EEF2F7"/>
           </w:tcPr>
           <w:p>
@@ -2317,13 +1384,26 @@
               <w:rPr>
                 <w:sz w:val="19"/>
               </w:rPr>
-              <w:t>Ene–feb</w:t>
+              <w:t>Revisar solicitudes pasadas, solo fechas y horas (</w:t>
+            </w:r>
+            <w:r>
+              <w:rPr>
+                <w:b/>
+                <w:sz w:val="19"/>
+              </w:rPr>
+              <w:t>si autoriza</w:t>
+            </w:r>
+            <w:r>
+              <w:rPr>
+                <w:sz w:val="19"/>
+              </w:rPr>
+              <w:t>)</w:t>
             </w:r>
           </w:p>
         </w:tc>
         <w:tc>
           <w:tcPr>
-            <w:tcW w:type="dxa" w:w="3249"/>
+            <w:tcW w:type="dxa" w:w="2436"/>
             <w:shd w:val="clear" w:color="auto" w:fill="EEF2F7"/>
           </w:tcPr>
           <w:p>
@@ -2339,13 +1419,13 @@
               <w:rPr>
                 <w:sz w:val="19"/>
               </w:rPr>
-              <w:t>Entrega, resumen de contribuciones, simulacros, defensa</w:t>
+              <w:t>Oficina de Torvesa</w:t>
             </w:r>
           </w:p>
         </w:tc>
         <w:tc>
           <w:tcPr>
-            <w:tcW w:type="dxa" w:w="3249"/>
+            <w:tcW w:type="dxa" w:w="2436"/>
             <w:shd w:val="clear" w:color="auto" w:fill="EEF2F7"/>
           </w:tcPr>
           <w:p>
@@ -2357,60 +1437,498 @@
                 <w:sz w:val="19"/>
               </w:rPr>
             </w:r>
-            <w:hyperlink r:id="rId34">
-              <w:r>
-                <w:rPr>
-                  <w:color w:val="B87333"/>
-                  <w:u w:val="single"/>
-                </w:rPr>
-                <w:t xml:space="preserve">#50</w:t>
-              </w:r>
-            </w:hyperlink>
             <w:r>
               <w:rPr>
                 <w:sz w:val="19"/>
               </w:rPr>
-              <w:t xml:space="preserve"> · </w:t>
+              <w:t>2 h</w:t>
             </w:r>
-            <w:hyperlink r:id="rId35">
-              <w:r>
-                <w:rPr>
-                  <w:color w:val="B87333"/>
-                  <w:u w:val="single"/>
-                </w:rPr>
-                <w:t xml:space="preserve">#51</w:t>
-              </w:r>
-            </w:hyperlink>
+          </w:p>
+        </w:tc>
+      </w:tr>
+      <w:tr>
+        <w:tc>
+          <w:tcPr>
+            <w:tcW w:type="dxa" w:w="2436"/>
+          </w:tcPr>
+          <w:p>
+            <w:pPr>
+              <w:spacing w:after="20"/>
+            </w:pPr>
             <w:r>
               <w:rPr>
                 <w:sz w:val="19"/>
               </w:rPr>
-              <w:t xml:space="preserve"> · </w:t>
             </w:r>
-            <w:hyperlink r:id="rId36">
-              <w:r>
-                <w:rPr>
-                  <w:color w:val="B87333"/>
-                  <w:u w:val="single"/>
-                </w:rPr>
-                <w:t xml:space="preserve">#52</w:t>
-              </w:r>
-            </w:hyperlink>
             <w:r>
               <w:rPr>
                 <w:sz w:val="19"/>
               </w:rPr>
-              <w:t xml:space="preserve"> · </w:t>
+              <w:t>Sáb 17</w:t>
             </w:r>
-            <w:hyperlink r:id="rId37">
-              <w:r>
-                <w:rPr>
-                  <w:color w:val="B87333"/>
-                  <w:u w:val="single"/>
-                </w:rPr>
-                <w:t xml:space="preserve">#53</w:t>
-              </w:r>
-            </w:hyperlink>
+          </w:p>
+        </w:tc>
+        <w:tc>
+          <w:tcPr>
+            <w:tcW w:type="dxa" w:w="2436"/>
+          </w:tcPr>
+          <w:p>
+            <w:pPr>
+              <w:spacing w:after="20"/>
+            </w:pPr>
+            <w:r>
+              <w:rPr>
+                <w:sz w:val="19"/>
+              </w:rPr>
+            </w:r>
+            <w:r>
+              <w:rPr>
+                <w:sz w:val="19"/>
+              </w:rPr>
+              <w:t xml:space="preserve">Investigar </w:t>
+            </w:r>
+            <w:r>
+              <w:rPr>
+                <w:b/>
+                <w:sz w:val="19"/>
+              </w:rPr>
+              <w:t>flujos de información y diseño de procesos (BPMN)</w:t>
+            </w:r>
+            <w:r>
+              <w:rPr>
+                <w:sz w:val="19"/>
+              </w:rPr>
+              <w:t xml:space="preserve"> (≥5 fuentes)</w:t>
+            </w:r>
+          </w:p>
+        </w:tc>
+        <w:tc>
+          <w:tcPr>
+            <w:tcW w:type="dxa" w:w="2436"/>
+          </w:tcPr>
+          <w:p>
+            <w:pPr>
+              <w:spacing w:after="20"/>
+            </w:pPr>
+            <w:r>
+              <w:rPr>
+                <w:sz w:val="19"/>
+              </w:rPr>
+            </w:r>
+            <w:r>
+              <w:rPr>
+                <w:rFonts w:ascii="Consolas" w:hAnsi="Consolas" w:cs="Consolas" w:eastAsia="Consolas"/>
+                <w:color w:val="0B1F3A"/>
+                <w:sz w:val="19"/>
+              </w:rPr>
+              <w:t>02_Fuentes/Metodologia/</w:t>
+            </w:r>
+          </w:p>
+        </w:tc>
+        <w:tc>
+          <w:tcPr>
+            <w:tcW w:type="dxa" w:w="2436"/>
+          </w:tcPr>
+          <w:p>
+            <w:pPr>
+              <w:spacing w:after="20"/>
+            </w:pPr>
+            <w:r>
+              <w:rPr>
+                <w:sz w:val="19"/>
+              </w:rPr>
+            </w:r>
+            <w:r>
+              <w:rPr>
+                <w:sz w:val="19"/>
+              </w:rPr>
+              <w:t>1,5 h</w:t>
+            </w:r>
+          </w:p>
+        </w:tc>
+      </w:tr>
+      <w:tr>
+        <w:tc>
+          <w:tcPr>
+            <w:tcW w:type="dxa" w:w="2436"/>
+            <w:shd w:val="clear" w:color="auto" w:fill="EEF2F7"/>
+          </w:tcPr>
+          <w:p>
+            <w:pPr>
+              <w:spacing w:after="20"/>
+            </w:pPr>
+            <w:r>
+              <w:rPr>
+                <w:sz w:val="19"/>
+              </w:rPr>
+            </w:r>
+            <w:r>
+              <w:rPr>
+                <w:sz w:val="19"/>
+              </w:rPr>
+              <w:t>Sáb 17</w:t>
+            </w:r>
+          </w:p>
+        </w:tc>
+        <w:tc>
+          <w:tcPr>
+            <w:tcW w:type="dxa" w:w="2436"/>
+            <w:shd w:val="clear" w:color="auto" w:fill="EEF2F7"/>
+          </w:tcPr>
+          <w:p>
+            <w:pPr>
+              <w:spacing w:after="20"/>
+            </w:pPr>
+            <w:r>
+              <w:rPr>
+                <w:sz w:val="19"/>
+              </w:rPr>
+            </w:r>
+            <w:r>
+              <w:rPr>
+                <w:sz w:val="19"/>
+              </w:rPr>
+              <w:t xml:space="preserve">Investigar </w:t>
+            </w:r>
+            <w:r>
+              <w:rPr>
+                <w:b/>
+                <w:sz w:val="19"/>
+              </w:rPr>
+              <w:t>CRMs móviles y herramientas existentes, con precios</w:t>
+            </w:r>
+            <w:r>
+              <w:rPr>
+                <w:sz w:val="19"/>
+              </w:rPr>
+              <w:t xml:space="preserve"> (≥6 herramientas)</w:t>
+            </w:r>
+          </w:p>
+        </w:tc>
+        <w:tc>
+          <w:tcPr>
+            <w:tcW w:type="dxa" w:w="2436"/>
+            <w:shd w:val="clear" w:color="auto" w:fill="EEF2F7"/>
+          </w:tcPr>
+          <w:p>
+            <w:pPr>
+              <w:spacing w:after="20"/>
+            </w:pPr>
+            <w:r>
+              <w:rPr>
+                <w:sz w:val="19"/>
+              </w:rPr>
+            </w:r>
+            <w:r>
+              <w:rPr>
+                <w:rFonts w:ascii="Consolas" w:hAnsi="Consolas" w:cs="Consolas" w:eastAsia="Consolas"/>
+                <w:color w:val="0B1F3A"/>
+                <w:sz w:val="19"/>
+              </w:rPr>
+              <w:t>02_Fuentes/Casos_Estudio/</w:t>
+            </w:r>
+            <w:r>
+              <w:rPr>
+                <w:sz w:val="19"/>
+              </w:rPr>
+              <w:t xml:space="preserve"> y </w:t>
+            </w:r>
+            <w:r>
+              <w:rPr>
+                <w:rFonts w:ascii="Consolas" w:hAnsi="Consolas" w:cs="Consolas" w:eastAsia="Consolas"/>
+                <w:color w:val="0B1F3A"/>
+                <w:sz w:val="19"/>
+              </w:rPr>
+              <w:t>02_Fuentes/Costos_Viabilidad/</w:t>
+            </w:r>
+          </w:p>
+        </w:tc>
+        <w:tc>
+          <w:tcPr>
+            <w:tcW w:type="dxa" w:w="2436"/>
+            <w:shd w:val="clear" w:color="auto" w:fill="EEF2F7"/>
+          </w:tcPr>
+          <w:p>
+            <w:pPr>
+              <w:spacing w:after="20"/>
+            </w:pPr>
+            <w:r>
+              <w:rPr>
+                <w:sz w:val="19"/>
+              </w:rPr>
+            </w:r>
+            <w:r>
+              <w:rPr>
+                <w:sz w:val="19"/>
+              </w:rPr>
+              <w:t>2 h</w:t>
+            </w:r>
+          </w:p>
+        </w:tc>
+      </w:tr>
+      <w:tr>
+        <w:tc>
+          <w:tcPr>
+            <w:tcW w:type="dxa" w:w="2436"/>
+          </w:tcPr>
+          <w:p>
+            <w:pPr>
+              <w:spacing w:after="20"/>
+            </w:pPr>
+            <w:r>
+              <w:rPr>
+                <w:sz w:val="19"/>
+              </w:rPr>
+            </w:r>
+            <w:r>
+              <w:rPr>
+                <w:sz w:val="19"/>
+              </w:rPr>
+              <w:t>Dom 18</w:t>
+            </w:r>
+          </w:p>
+        </w:tc>
+        <w:tc>
+          <w:tcPr>
+            <w:tcW w:type="dxa" w:w="2436"/>
+          </w:tcPr>
+          <w:p>
+            <w:pPr>
+              <w:spacing w:after="20"/>
+            </w:pPr>
+            <w:r>
+              <w:rPr>
+                <w:sz w:val="19"/>
+              </w:rPr>
+            </w:r>
+            <w:r>
+              <w:rPr>
+                <w:sz w:val="19"/>
+              </w:rPr>
+              <w:t>Tabular los datos de campo con Víctor (si hubo campo)</w:t>
+            </w:r>
+          </w:p>
+        </w:tc>
+        <w:tc>
+          <w:tcPr>
+            <w:tcW w:type="dxa" w:w="2436"/>
+          </w:tcPr>
+          <w:p>
+            <w:pPr>
+              <w:spacing w:after="20"/>
+            </w:pPr>
+            <w:r>
+              <w:rPr>
+                <w:sz w:val="19"/>
+              </w:rPr>
+            </w:r>
+            <w:r>
+              <w:rPr>
+                <w:rFonts w:ascii="Consolas" w:hAnsi="Consolas" w:cs="Consolas" w:eastAsia="Consolas"/>
+                <w:color w:val="0B1F3A"/>
+                <w:sz w:val="19"/>
+              </w:rPr>
+              <w:t>05_Datos_Campo/LineaBase_2026-10/</w:t>
+            </w:r>
+          </w:p>
+        </w:tc>
+        <w:tc>
+          <w:tcPr>
+            <w:tcW w:type="dxa" w:w="2436"/>
+          </w:tcPr>
+          <w:p>
+            <w:pPr>
+              <w:spacing w:after="20"/>
+            </w:pPr>
+            <w:r>
+              <w:rPr>
+                <w:sz w:val="19"/>
+              </w:rPr>
+            </w:r>
+            <w:r>
+              <w:rPr>
+                <w:sz w:val="19"/>
+              </w:rPr>
+              <w:t>2 h</w:t>
+            </w:r>
+          </w:p>
+        </w:tc>
+      </w:tr>
+      <w:tr>
+        <w:tc>
+          <w:tcPr>
+            <w:tcW w:type="dxa" w:w="2436"/>
+            <w:shd w:val="clear" w:color="auto" w:fill="EEF2F7"/>
+          </w:tcPr>
+          <w:p>
+            <w:pPr>
+              <w:spacing w:after="20"/>
+            </w:pPr>
+            <w:r>
+              <w:rPr>
+                <w:sz w:val="19"/>
+              </w:rPr>
+            </w:r>
+            <w:r>
+              <w:rPr>
+                <w:sz w:val="19"/>
+              </w:rPr>
+              <w:t>Dom 18</w:t>
+            </w:r>
+          </w:p>
+        </w:tc>
+        <w:tc>
+          <w:tcPr>
+            <w:tcW w:type="dxa" w:w="2436"/>
+            <w:shd w:val="clear" w:color="auto" w:fill="EEF2F7"/>
+          </w:tcPr>
+          <w:p>
+            <w:pPr>
+              <w:spacing w:after="20"/>
+            </w:pPr>
+            <w:r>
+              <w:rPr>
+                <w:sz w:val="19"/>
+              </w:rPr>
+            </w:r>
+            <w:r>
+              <w:rPr>
+                <w:sz w:val="19"/>
+              </w:rPr>
+              <w:t>Resumen de 1 página para Víctor (CRMs y flujos)</w:t>
+            </w:r>
+          </w:p>
+        </w:tc>
+        <w:tc>
+          <w:tcPr>
+            <w:tcW w:type="dxa" w:w="2436"/>
+            <w:shd w:val="clear" w:color="auto" w:fill="EEF2F7"/>
+          </w:tcPr>
+          <w:p>
+            <w:pPr>
+              <w:spacing w:after="20"/>
+            </w:pPr>
+            <w:r>
+              <w:rPr>
+                <w:sz w:val="19"/>
+              </w:rPr>
+            </w:r>
+            <w:r>
+              <w:rPr>
+                <w:rFonts w:ascii="Consolas" w:hAnsi="Consolas" w:cs="Consolas" w:eastAsia="Consolas"/>
+                <w:color w:val="0B1F3A"/>
+                <w:sz w:val="19"/>
+              </w:rPr>
+              <w:t>02_Fuentes/Casos_Estudio/2026-10-18_Resumen_CRM_Flujos.md</w:t>
+            </w:r>
+          </w:p>
+        </w:tc>
+        <w:tc>
+          <w:tcPr>
+            <w:tcW w:type="dxa" w:w="2436"/>
+            <w:shd w:val="clear" w:color="auto" w:fill="EEF2F7"/>
+          </w:tcPr>
+          <w:p>
+            <w:pPr>
+              <w:spacing w:after="20"/>
+            </w:pPr>
+            <w:r>
+              <w:rPr>
+                <w:sz w:val="19"/>
+              </w:rPr>
+            </w:r>
+            <w:r>
+              <w:rPr>
+                <w:sz w:val="19"/>
+              </w:rPr>
+              <w:t>0,5 h</w:t>
+            </w:r>
+          </w:p>
+        </w:tc>
+      </w:tr>
+      <w:tr>
+        <w:tc>
+          <w:tcPr>
+            <w:tcW w:type="dxa" w:w="2436"/>
+          </w:tcPr>
+          <w:p>
+            <w:pPr>
+              <w:spacing w:after="20"/>
+            </w:pPr>
+            <w:r>
+              <w:rPr>
+                <w:sz w:val="19"/>
+              </w:rPr>
+            </w:r>
+            <w:r>
+              <w:rPr>
+                <w:sz w:val="19"/>
+              </w:rPr>
+              <w:t>Dom 18</w:t>
+            </w:r>
+          </w:p>
+        </w:tc>
+        <w:tc>
+          <w:tcPr>
+            <w:tcW w:type="dxa" w:w="2436"/>
+          </w:tcPr>
+          <w:p>
+            <w:pPr>
+              <w:spacing w:after="20"/>
+            </w:pPr>
+            <w:r>
+              <w:rPr>
+                <w:sz w:val="19"/>
+              </w:rPr>
+            </w:r>
+            <w:r>
+              <w:rPr>
+                <w:sz w:val="19"/>
+              </w:rPr>
+              <w:t>Revisión de la semana con Víctor (más abajo)</w:t>
+            </w:r>
+          </w:p>
+        </w:tc>
+        <w:tc>
+          <w:tcPr>
+            <w:tcW w:type="dxa" w:w="2436"/>
+          </w:tcPr>
+          <w:p>
+            <w:pPr>
+              <w:spacing w:after="20"/>
+            </w:pPr>
+            <w:r>
+              <w:rPr>
+                <w:sz w:val="19"/>
+              </w:rPr>
+            </w:r>
+            <w:r>
+              <w:rPr>
+                <w:sz w:val="19"/>
+              </w:rPr>
+              <w:t>Llamada</w:t>
+            </w:r>
+          </w:p>
+        </w:tc>
+        <w:tc>
+          <w:tcPr>
+            <w:tcW w:type="dxa" w:w="2436"/>
+          </w:tcPr>
+          <w:p>
+            <w:pPr>
+              <w:spacing w:after="20"/>
+            </w:pPr>
+            <w:r>
+              <w:rPr>
+                <w:sz w:val="19"/>
+              </w:rPr>
+            </w:r>
+            <w:r>
+              <w:rPr>
+                <w:sz w:val="19"/>
+              </w:rPr>
+              <w:t>1 h</w:t>
+            </w:r>
           </w:p>
         </w:tc>
       </w:tr>
@@ -2418,38 +1936,66 @@
     <w:p/>
     <w:p>
       <w:r>
-        <w:rPr>
-          <w:b/>
-        </w:rPr>
-        <w:t>Dependencias que te afectan:</w:t>
-      </w:r>
-    </w:p>
-    <w:p>
-      <w:pPr>
-        <w:pStyle w:val="ListBullet"/>
-      </w:pPr>
-      <w:r>
         <w:rPr/>
-        <w:t xml:space="preserve">No levantes la bóveda del sistema (#24) sin los flujos TO-BE </w:t>
+        <w:t xml:space="preserve">Si Torvesa </w:t>
       </w:r>
       <w:r>
         <w:rPr>
           <w:b/>
         </w:rPr>
-        <w:t>aprobados</w:t>
+        <w:t>no</w:t>
       </w:r>
       <w:r>
         <w:rPr/>
-        <w:t xml:space="preserve"> por Víctor (#22 → S4-02).</w:t>
+        <w:t xml:space="preserve"> autoriza el campo, el jueves y el viernes adelantas la investigación del sábado.</w:t>
       </w:r>
     </w:p>
     <w:p>
-      <w:pPr>
-        <w:pStyle w:val="ListBullet"/>
-      </w:pPr>
+      <w:r>
+        <w:rPr>
+          <w:b/>
+        </w:rPr>
+        <w:t>Cómo buscar fuentes:</w:t>
+      </w:r>
       <w:r>
         <w:rPr/>
-        <w:t>La PoC (#31) es requisito de la validación del diseño en operación experimental controlada (#37).</w:t>
+        <w:t xml:space="preserve"> con los scripts de búsqueda (</w:t>
+      </w:r>
+      <w:r>
+        <w:rPr>
+          <w:rFonts w:ascii="Consolas" w:hAnsi="Consolas" w:cs="Consolas" w:eastAsia="Consolas"/>
+          <w:color w:val="0B1F3A"/>
+          <w:sz w:val="19"/>
+        </w:rPr>
+        <w:t>99_Scripts/busqueda/</w:t>
+      </w:r>
+      <w:r>
+        <w:rPr/>
+        <w:t xml:space="preserve">; la guía de uso es </w:t>
+      </w:r>
+      <w:r>
+        <w:rPr>
+          <w:rFonts w:ascii="Consolas" w:hAnsi="Consolas" w:cs="Consolas" w:eastAsia="Consolas"/>
+          <w:color w:val="0B1F3A"/>
+          <w:sz w:val="19"/>
+        </w:rPr>
+        <w:t>99_Scripts/busqueda/Guia_Busqueda.pdf</w:t>
+      </w:r>
+      <w:r>
+        <w:rPr/>
+        <w:t xml:space="preserve">). Cada fuente lleva su ficha, hecha con la plantilla </w:t>
+      </w:r>
+      <w:r>
+        <w:rPr>
+          <w:rFonts w:ascii="Consolas" w:hAnsi="Consolas" w:cs="Consolas" w:eastAsia="Consolas"/>
+          <w:color w:val="0B1F3A"/>
+          <w:sz w:val="19"/>
+        </w:rPr>
+        <w:t>99_Scripts/plantillas/ficha_fuente.md</w:t>
+      </w:r>
+      <w:r>
+        <w:rPr/>
+        <w:t>. Una fuente está «verificada» solo si la abriste y el dato está ahí, con página.</w:t>
       </w:r>
     </w:p>
     <w:p>
@@ -2460,367 +2006,43 @@
         </w:pBdr>
       </w:pPr>
       <w:r>
-        <w:t>5. Reglas</w:t>
-      </w:r>
-    </w:p>
-    <w:p>
-      <w:pPr>
-        <w:pStyle w:val="ListBullet"/>
-      </w:pPr>
-      <w:r>
-        <w:rPr>
-          <w:b/>
-        </w:rPr>
-        <w:t>Datos personales:</w:t>
-      </w:r>
-      <w:r>
-        <w:rPr/>
-        <w:t xml:space="preserve"> nunca en el repo. Nombres, teléfonos, correos, cédulas, audios y escaneos van a </w:t>
-      </w:r>
-      <w:r>
-        <w:rPr>
-          <w:rFonts w:ascii="Consolas" w:hAnsi="Consolas" w:cs="Consolas" w:eastAsia="Consolas"/>
-          <w:color w:val="0B1F3A"/>
-          <w:sz w:val="19"/>
-        </w:rPr>
-        <w:t>05_Datos_Campo/_crudo/</w:t>
-      </w:r>
-      <w:r>
-        <w:rPr/>
-        <w:t>, que Git ignora.</w:t>
-      </w:r>
-    </w:p>
-    <w:p>
-      <w:pPr>
-        <w:pStyle w:val="ListBullet"/>
-      </w:pPr>
-      <w:r>
-        <w:rPr>
-          <w:b/>
-        </w:rPr>
-        <w:t>Antes de cada push con datos:</w:t>
-      </w:r>
-    </w:p>
-    <w:p>
-      <w:r>
-        <w:rPr>
-          <w:rFonts w:ascii="Consolas" w:hAnsi="Consolas" w:cs="Consolas" w:eastAsia="Consolas"/>
-          <w:color w:val="0B1F3A"/>
-          <w:sz w:val="19"/>
-        </w:rPr>
-        <w:t>``powershel</w:t>
+        <w:t>4. Tus tareas de todo el semestre</w:t>
       </w:r>
     </w:p>
     <w:p>
       <w:r>
         <w:rPr/>
-        <w:t>&lt;tu-venv&gt;\Scripts\python.exe 99_Scripts\auditoria_pii.py    # debe decir: 0 hallazgos</w:t>
+        <w:t xml:space="preserve">Todo está, día por día, en </w:t>
       </w:r>
-    </w:p>
-    <w:p>
-      <w:r>
-        <w:rPr>
-          <w:rFonts w:ascii="Consolas" w:hAnsi="Consolas" w:cs="Consolas" w:eastAsia="Consolas"/>
-          <w:color w:val="0B1F3A"/>
-          <w:sz w:val="19"/>
-        </w:rPr>
-        <w:t>`</w:t>
-      </w:r>
-    </w:p>
-    <w:p>
-      <w:pPr>
-        <w:pStyle w:val="ListBullet"/>
-      </w:pPr>
       <w:r>
         <w:rPr>
           <w:b/>
         </w:rPr>
-        <w:t>Nombres de archivo:</w:t>
+        <w:t>`11_Planificacion/Cronograma_Tesis.xlsx`</w:t>
       </w:r>
       <w:r>
         <w:rPr/>
-        <w:t xml:space="preserve"> </w:t>
+        <w:t>, con una hoja por semana (sprint). En GitHub, cada entregable tiene su ficha (</w:t>
       </w:r>
       <w:r>
         <w:rPr>
-          <w:rFonts w:ascii="Consolas" w:hAnsi="Consolas" w:cs="Consolas" w:eastAsia="Consolas"/>
-          <w:color w:val="0B1F3A"/>
-          <w:sz w:val="19"/>
+          <w:i/>
         </w:rPr>
-        <w:t>AAAA-MM-DD_tema_vX.Y.ext</w:t>
+        <w:t>issue</w:t>
       </w:r>
       <w:r>
         <w:rPr/>
-        <w:t xml:space="preserve">, por ejemplo </w:t>
+        <w:t xml:space="preserve">): </w:t>
       </w:r>
-      <w:r>
-        <w:rPr>
-          <w:rFonts w:ascii="Consolas" w:hAnsi="Consolas" w:cs="Consolas" w:eastAsia="Consolas"/>
-          <w:color w:val="0B1F3A"/>
-          <w:sz w:val="19"/>
-        </w:rPr>
-        <w:t>2026-11-04_TO-BE_Proceso1_v0.1.md</w:t>
-      </w:r>
-      <w:r>
-        <w:rPr/>
-        <w:t>.</w:t>
-      </w:r>
-    </w:p>
-    <w:p>
-      <w:pPr>
-        <w:pStyle w:val="ListBullet"/>
-      </w:pPr>
-      <w:r>
-        <w:rPr>
-          <w:b/>
-        </w:rPr>
-        <w:t>Commits:</w:t>
-      </w:r>
-      <w:r>
-        <w:rPr/>
-        <w:t xml:space="preserve"> </w:t>
-      </w:r>
-      <w:r>
-        <w:rPr>
-          <w:rFonts w:ascii="Consolas" w:hAnsi="Consolas" w:cs="Consolas" w:eastAsia="Consolas"/>
-          <w:color w:val="0B1F3A"/>
-          <w:sz w:val="19"/>
-        </w:rPr>
-        <w:t>ID: qué hiciste (#n)</w:t>
-      </w:r>
-      <w:r>
-        <w:rPr/>
-        <w:t xml:space="preserve">, por ejemplo </w:t>
-      </w:r>
-      <w:r>
-        <w:rPr>
-          <w:rFonts w:ascii="Consolas" w:hAnsi="Consolas" w:cs="Consolas" w:eastAsia="Consolas"/>
-          <w:color w:val="0B1F3A"/>
-          <w:sz w:val="19"/>
-        </w:rPr>
-        <w:t>S2-05: AS-IS en Mermaid (#17)</w:t>
-      </w:r>
-      <w:r>
-        <w:rPr/>
-        <w:t xml:space="preserve">. Con </w:t>
-      </w:r>
-      <w:r>
-        <w:rPr>
-          <w:rFonts w:ascii="Consolas" w:hAnsi="Consolas" w:cs="Consolas" w:eastAsia="Consolas"/>
-          <w:color w:val="0B1F3A"/>
-          <w:sz w:val="19"/>
-        </w:rPr>
-        <w:t>closes #n</w:t>
-      </w:r>
-      <w:r>
-        <w:rPr/>
-        <w:t xml:space="preserve"> se cierra el issue.</w:t>
-      </w:r>
-    </w:p>
-    <w:p>
-      <w:pPr>
-        <w:pStyle w:val="ListBullet"/>
-      </w:pPr>
-      <w:r>
-        <w:rPr>
-          <w:b/>
-        </w:rPr>
-        <w:t>Uso de IA:</w:t>
-      </w:r>
-      <w:r>
-        <w:rPr/>
-        <w:t xml:space="preserve"> si una herramienta de IA te ayudó, ponlo en el commit (</w:t>
-      </w:r>
-      <w:r>
-        <w:rPr>
-          <w:rFonts w:ascii="Consolas" w:hAnsi="Consolas" w:cs="Consolas" w:eastAsia="Consolas"/>
-          <w:color w:val="0B1F3A"/>
-          <w:sz w:val="19"/>
-        </w:rPr>
-        <w:t>[IA: Claude]</w:t>
-      </w:r>
-      <w:r>
-        <w:rPr/>
-        <w:t xml:space="preserve">) y en </w:t>
-      </w:r>
-      <w:r>
-        <w:rPr>
-          <w:rFonts w:ascii="Consolas" w:hAnsi="Consolas" w:cs="Consolas" w:eastAsia="Consolas"/>
-          <w:color w:val="0B1F3A"/>
-          <w:sz w:val="19"/>
-        </w:rPr>
-        <w:t>09_Registro_Contribuciones</w:t>
-      </w:r>
-      <w:r>
-        <w:rPr/>
-        <w:t>. La tesis tiene que declararlo.</w:t>
-      </w:r>
-    </w:p>
-    <w:p>
-      <w:pPr>
-        <w:pStyle w:val="ListBullet"/>
-      </w:pPr>
-      <w:r>
-        <w:rPr>
-          <w:b/>
-        </w:rPr>
-        <w:t>Nunca</w:t>
-      </w:r>
-      <w:r>
-        <w:rPr/>
-        <w:t xml:space="preserve"> </w:t>
-      </w:r>
-      <w:r>
-        <w:rPr>
-          <w:rFonts w:ascii="Consolas" w:hAnsi="Consolas" w:cs="Consolas" w:eastAsia="Consolas"/>
-          <w:color w:val="0B1F3A"/>
-          <w:sz w:val="19"/>
-        </w:rPr>
-        <w:t>git push --force</w:t>
-      </w:r>
-      <w:r>
-        <w:rPr/>
-        <w:t>, ni mover o renombrar carpetas de Víctor sin avisar.</w:t>
-      </w:r>
-    </w:p>
-    <w:p>
-      <w:pPr>
-        <w:pStyle w:val="ListBullet"/>
-      </w:pPr>
-      <w:r>
-        <w:rPr/>
-        <w:t>Ejemplos con clientes: siempre ficticios o codificados (</w:t>
-      </w:r>
-      <w:r>
-        <w:rPr>
-          <w:rFonts w:ascii="Consolas" w:hAnsi="Consolas" w:cs="Consolas" w:eastAsia="Consolas"/>
-          <w:color w:val="0B1F3A"/>
-          <w:sz w:val="19"/>
-        </w:rPr>
-        <w:t>CLI-0001</w:t>
-      </w:r>
-      <w:r>
-        <w:rPr/>
-        <w:t>), nunca reales.</w:t>
-      </w:r>
-    </w:p>
-    <w:p>
-      <w:pPr>
-        <w:pStyle w:val="Heading1"/>
-        <w:pBdr>
-          <w:bottom w:val="single" w:sz="10" w:space="4" w:color="B87333"/>
-        </w:pBdr>
-      </w:pPr>
-      <w:r>
-        <w:t>6. Cómo reportar avances</w:t>
-      </w:r>
-    </w:p>
-    <w:p>
-      <w:pPr>
-        <w:pStyle w:val="ListNumber"/>
-      </w:pPr>
-      <w:r>
-        <w:rPr>
-          <w:b/>
-        </w:rPr>
-        <w:t>Durante la semana:</w:t>
-      </w:r>
-      <w:r>
-        <w:rPr/>
-        <w:t xml:space="preserve"> mueve tus issues en el tablero (Por hacer → En curso → En revisión → Hecho) y comenta en el issue lo que bloquee.</w:t>
-      </w:r>
-    </w:p>
-    <w:p>
-      <w:pPr>
-        <w:pStyle w:val="ListNumber"/>
-      </w:pPr>
-      <w:r>
-        <w:rPr>
-          <w:b/>
-        </w:rPr>
-        <w:t>Al cerrar un entregable:</w:t>
-      </w:r>
-      <w:r>
-        <w:rPr/>
-        <w:t xml:space="preserve"> </w:t>
-      </w:r>
-      <w:r>
-        <w:rPr>
-          <w:rFonts w:ascii="Consolas" w:hAnsi="Consolas" w:cs="Consolas" w:eastAsia="Consolas"/>
-          <w:color w:val="0B1F3A"/>
-          <w:sz w:val="19"/>
-        </w:rPr>
-        <w:t>closes #n</w:t>
-      </w:r>
-      <w:r>
-        <w:rPr/>
-        <w:t xml:space="preserve"> en el commit + una fila en </w:t>
-      </w:r>
-      <w:r>
-        <w:rPr>
-          <w:rFonts w:ascii="Consolas" w:hAnsi="Consolas" w:cs="Consolas" w:eastAsia="Consolas"/>
-          <w:color w:val="0B1F3A"/>
-          <w:sz w:val="19"/>
-        </w:rPr>
-        <w:t>09_Registro_Contribuciones/Registro_Contribuciones.md</w:t>
-      </w:r>
-      <w:r>
-        <w:rPr/>
-        <w:t>.</w:t>
-      </w:r>
-    </w:p>
-    <w:p>
-      <w:pPr>
-        <w:pStyle w:val="ListNumber"/>
-      </w:pPr>
-      <w:r>
-        <w:rPr>
-          <w:b/>
-        </w:rPr>
-        <w:t>Domingo, antes de las 21:00:</w:t>
-      </w:r>
-      <w:r>
-        <w:rPr/>
-        <w:t xml:space="preserve"> todo lo de la semana tiene que estar en </w:t>
-      </w:r>
-      <w:r>
-        <w:rPr>
-          <w:rFonts w:ascii="Consolas" w:hAnsi="Consolas" w:cs="Consolas" w:eastAsia="Consolas"/>
-          <w:color w:val="0B1F3A"/>
-          <w:sz w:val="19"/>
-        </w:rPr>
-        <w:t>main</w:t>
-      </w:r>
-      <w:r>
-        <w:rPr/>
-        <w:t>. A esa hora se genera el informe automático de avance (commits por autor, tareas cerradas y pendientes).</w:t>
-      </w:r>
-    </w:p>
-    <w:p>
-      <w:pPr>
-        <w:pStyle w:val="ListNumber"/>
-      </w:pPr>
-      <w:r>
-        <w:rPr>
-          <w:b/>
-        </w:rPr>
-        <w:t>Bloqueos urgentes:</w:t>
-      </w:r>
-      <w:r>
-        <w:rPr/>
-        <w:t xml:space="preserve"> WhatsApp a Víctor, y luego deja el registro en el issue.</w:t>
-      </w:r>
-    </w:p>
-    <w:p>
-      <w:pPr>
-        <w:pStyle w:val="Heading1"/>
-        <w:pBdr>
-          <w:bottom w:val="single" w:sz="10" w:space="4" w:color="B87333"/>
-        </w:pBdr>
-      </w:pPr>
-      <w:r>
-        <w:t>7. A quién preguntar qué</w:t>
-      </w:r>
+      <w:hyperlink r:id="rId10">
+        <w:r>
+          <w:rPr>
+            <w:color w:val="B87333"/>
+            <w:u w:val="single"/>
+          </w:rPr>
+          <w:t xml:space="preserve">https://github.com/l333x/Tesis_Torvesa/issues</w:t>
+        </w:r>
+      </w:hyperlink>
     </w:p>
     <w:tbl>
       <w:tblPr>
@@ -2859,7 +2081,7 @@
                 <w:color w:val="FFFFFF"/>
                 <w:sz w:val="19"/>
               </w:rPr>
-              <w:t>Tema</w:t>
+              <w:t>Semana</w:t>
             </w:r>
           </w:p>
         </w:tc>
@@ -2880,7 +2102,7 @@
                 <w:color w:val="FFFFFF"/>
                 <w:sz w:val="19"/>
               </w:rPr>
-              <w:t>Pregunta a</w:t>
+              <w:t>Lo principal tuyo</w:t>
             </w:r>
           </w:p>
         </w:tc>
@@ -2903,7 +2125,7 @@
               <w:rPr>
                 <w:sz w:val="19"/>
               </w:rPr>
-              <w:t>Qué dice el diseño aprobado, alcance, metas, tutora, Torvesa, permisos</w:t>
+              <w:t>S1 · 12–18 oct</w:t>
             </w:r>
           </w:p>
         </w:tc>
@@ -2924,7 +2146,7 @@
               <w:rPr>
                 <w:sz w:val="19"/>
               </w:rPr>
-              <w:t>Víctor</w:t>
+              <w:t>Investigar bóvedas, RAG, flujos y CRMs (#54, #55, #56) · campo si Torvesa autoriza (#9)</w:t>
             </w:r>
           </w:p>
         </w:tc>
@@ -2948,7 +2170,7 @@
               <w:rPr>
                 <w:sz w:val="19"/>
               </w:rPr>
-              <w:t>Fuentes, APA, instrumentos, consentimientos</w:t>
+              <w:t>S2 · 19–25 oct</w:t>
             </w:r>
           </w:p>
         </w:tc>
@@ -2970,7 +2192,7 @@
               <w:rPr>
                 <w:sz w:val="19"/>
               </w:rPr>
-              <w:t>Víctor</w:t>
+              <w:t>Analizar los datos de campo (#16) · dibujar el proceso actual (AS-IS) (#17) · comparar herramientas (#18)</w:t>
             </w:r>
           </w:p>
         </w:tc>
@@ -2993,7 +2215,7 @@
               <w:rPr>
                 <w:sz w:val="19"/>
               </w:rPr>
-              <w:t>Git, RAG, scripts, bóveda del sistema, flujos, PoC</w:t>
+              <w:t>S3 · 26 oct–1 nov</w:t>
             </w:r>
           </w:p>
         </w:tc>
@@ -3014,7 +2236,7 @@
               <w:rPr>
                 <w:sz w:val="19"/>
               </w:rPr>
-              <w:t>tú decides; consulta a Víctor si cambia el alcance</w:t>
+              <w:t>Preparar figuras para la Revisión 1 con la tutora (#21) · leer los patrones de la bóveda de Víctor (#60)</w:t>
             </w:r>
           </w:p>
         </w:tc>
@@ -3038,7 +2260,7 @@
               <w:rPr>
                 <w:sz w:val="19"/>
               </w:rPr>
-              <w:t>Datos de campo: ¿esto es dato personal?</w:t>
+              <w:t>S4 · 2–8 nov</w:t>
             </w:r>
           </w:p>
         </w:tc>
@@ -3060,34 +2282,20 @@
               <w:rPr>
                 <w:sz w:val="19"/>
               </w:rPr>
-              <w:t xml:space="preserve">ante la duda, </w:t>
+              <w:t xml:space="preserve">Dibujar el proceso con el sistema (TO-BE) (#22) · </w:t>
             </w:r>
             <w:r>
               <w:rPr>
                 <w:b/>
                 <w:sz w:val="19"/>
               </w:rPr>
-              <w:t>es</w:t>
+              <w:t>construir la bóveda del sistema</w:t>
             </w:r>
             <w:r>
               <w:rPr>
                 <w:sz w:val="19"/>
               </w:rPr>
-              <w:t xml:space="preserve">: va a </w:t>
-            </w:r>
-            <w:r>
-              <w:rPr>
-                <w:rFonts w:ascii="Consolas" w:hAnsi="Consolas" w:cs="Consolas" w:eastAsia="Consolas"/>
-                <w:color w:val="0B1F3A"/>
-                <w:sz w:val="19"/>
-              </w:rPr>
-              <w:t>_crudo/</w:t>
-            </w:r>
-            <w:r>
-              <w:rPr>
-                <w:sz w:val="19"/>
-              </w:rPr>
-              <w:t xml:space="preserve"> y se le pregunta a Víctor</w:t>
+              <w:t xml:space="preserve"> (#24)</w:t>
             </w:r>
           </w:p>
         </w:tc>
@@ -3110,7 +2318,7 @@
               <w:rPr>
                 <w:sz w:val="19"/>
               </w:rPr>
-              <w:t>Algo del sistema de la bóveda (lanzadores, respaldos)</w:t>
+              <w:t>S5 · 9–15 nov</w:t>
             </w:r>
           </w:p>
         </w:tc>
@@ -3129,17 +2337,806 @@
             </w:r>
             <w:r>
               <w:rPr>
-                <w:rFonts w:ascii="Consolas" w:hAnsi="Consolas" w:cs="Consolas" w:eastAsia="Consolas"/>
-                <w:color w:val="0B1F3A"/>
                 <w:sz w:val="19"/>
               </w:rPr>
-              <w:t>ARRANQUE.md</w:t>
+              <w:t>Prueba de concepto: formulario → servidor → bóveda → borrador con IA (#31) · 3 casos de prueba (#32)</w:t>
+            </w:r>
+          </w:p>
+        </w:tc>
+      </w:tr>
+      <w:tr>
+        <w:tc>
+          <w:tcPr>
+            <w:tcW w:type="dxa" w:w="4873"/>
+            <w:shd w:val="clear" w:color="auto" w:fill="EEF2F7"/>
+          </w:tcPr>
+          <w:p>
+            <w:pPr>
+              <w:spacing w:after="20"/>
+            </w:pPr>
+            <w:r>
+              <w:rPr>
+                <w:sz w:val="19"/>
+              </w:rPr>
+            </w:r>
+            <w:r>
+              <w:rPr>
+                <w:sz w:val="19"/>
+              </w:rPr>
+              <w:t>S6 · 16–22 nov</w:t>
+            </w:r>
+          </w:p>
+        </w:tc>
+        <w:tc>
+          <w:tcPr>
+            <w:tcW w:type="dxa" w:w="4873"/>
+            <w:shd w:val="clear" w:color="auto" w:fill="EEF2F7"/>
+          </w:tcPr>
+          <w:p>
+            <w:pPr>
+              <w:spacing w:after="20"/>
+            </w:pPr>
+            <w:r>
+              <w:rPr>
+                <w:sz w:val="19"/>
+              </w:rPr>
+            </w:r>
+            <w:r>
+              <w:rPr>
+                <w:sz w:val="19"/>
+              </w:rPr>
+              <w:t>Revisión 2 con la tutora (#33) · dejar estable la prueba de concepto</w:t>
+            </w:r>
+          </w:p>
+        </w:tc>
+      </w:tr>
+      <w:tr>
+        <w:tc>
+          <w:tcPr>
+            <w:tcW w:type="dxa" w:w="4873"/>
+          </w:tcPr>
+          <w:p>
+            <w:pPr>
+              <w:spacing w:after="20"/>
+            </w:pPr>
+            <w:r>
+              <w:rPr>
+                <w:sz w:val="19"/>
+              </w:rPr>
+            </w:r>
+            <w:r>
+              <w:rPr>
+                <w:sz w:val="19"/>
+              </w:rPr>
+              <w:t>S7–S8 · 23 nov–6 dic</w:t>
+            </w:r>
+          </w:p>
+        </w:tc>
+        <w:tc>
+          <w:tcPr>
+            <w:tcW w:type="dxa" w:w="4873"/>
+          </w:tcPr>
+          <w:p>
+            <w:pPr>
+              <w:spacing w:after="20"/>
+            </w:pPr>
+            <w:r>
+              <w:rPr>
+                <w:sz w:val="19"/>
+              </w:rPr>
+            </w:r>
+            <w:r>
+              <w:rPr>
+                <w:sz w:val="19"/>
+              </w:rPr>
+              <w:t>Validación del diseño en Torvesa (#37) · documentar herramientas, datos, asistente y manual (#38–#42)</w:t>
+            </w:r>
+          </w:p>
+        </w:tc>
+      </w:tr>
+      <w:tr>
+        <w:tc>
+          <w:tcPr>
+            <w:tcW w:type="dxa" w:w="4873"/>
+            <w:shd w:val="clear" w:color="auto" w:fill="EEF2F7"/>
+          </w:tcPr>
+          <w:p>
+            <w:pPr>
+              <w:spacing w:after="20"/>
+            </w:pPr>
+            <w:r>
+              <w:rPr>
+                <w:sz w:val="19"/>
+              </w:rPr>
+            </w:r>
+            <w:r>
+              <w:rPr>
+                <w:sz w:val="19"/>
+              </w:rPr>
+              <w:t>S9–S10 · 7–20 dic</w:t>
+            </w:r>
+          </w:p>
+        </w:tc>
+        <w:tc>
+          <w:tcPr>
+            <w:tcW w:type="dxa" w:w="4873"/>
+            <w:shd w:val="clear" w:color="auto" w:fill="EEF2F7"/>
+          </w:tcPr>
+          <w:p>
+            <w:pPr>
+              <w:spacing w:after="20"/>
+            </w:pPr>
+            <w:r>
+              <w:rPr>
+                <w:sz w:val="19"/>
+              </w:rPr>
+            </w:r>
+            <w:r>
+              <w:rPr>
+                <w:sz w:val="19"/>
+              </w:rPr>
+              <w:t>Medición del «después» (#43) · pruebas (#45) · tesis al 90 % (#47)</w:t>
+            </w:r>
+          </w:p>
+        </w:tc>
+      </w:tr>
+      <w:tr>
+        <w:tc>
+          <w:tcPr>
+            <w:tcW w:type="dxa" w:w="4873"/>
+          </w:tcPr>
+          <w:p>
+            <w:pPr>
+              <w:spacing w:after="20"/>
+            </w:pPr>
+            <w:r>
+              <w:rPr>
+                <w:sz w:val="19"/>
+              </w:rPr>
+            </w:r>
+            <w:r>
+              <w:rPr>
+                <w:sz w:val="19"/>
+              </w:rPr>
+              <w:t>Ene–feb</w:t>
+            </w:r>
+          </w:p>
+        </w:tc>
+        <w:tc>
+          <w:tcPr>
+            <w:tcW w:type="dxa" w:w="4873"/>
+          </w:tcPr>
+          <w:p>
+            <w:pPr>
+              <w:spacing w:after="20"/>
+            </w:pPr>
+            <w:r>
+              <w:rPr>
+                <w:sz w:val="19"/>
+              </w:rPr>
+            </w:r>
+            <w:r>
+              <w:rPr>
+                <w:sz w:val="19"/>
+              </w:rPr>
+              <w:t>Entrega y preparación de la defensa (#50–#53)</w:t>
             </w:r>
           </w:p>
         </w:tc>
       </w:tr>
     </w:tbl>
     <w:p/>
+    <w:p>
+      <w:pPr>
+        <w:pStyle w:val="Heading1"/>
+        <w:pBdr>
+          <w:bottom w:val="single" w:sz="10" w:space="4" w:color="B87333"/>
+        </w:pBdr>
+      </w:pPr>
+      <w:r>
+        <w:t>5. Conocimiento compartido (para la defensa)</w:t>
+      </w:r>
+    </w:p>
+    <w:p>
+      <w:r>
+        <w:rPr/>
+        <w:t xml:space="preserve">En la defensa el tribunal nos pregunta </w:t>
+      </w:r>
+      <w:r>
+        <w:rPr>
+          <w:b/>
+        </w:rPr>
+        <w:t>a los dos lo mismo</w:t>
+      </w:r>
+      <w:r>
+        <w:rPr/>
+        <w:t>. Por eso:</w:t>
+      </w:r>
+    </w:p>
+    <w:p>
+      <w:pPr>
+        <w:pStyle w:val="ListBullet"/>
+      </w:pPr>
+      <w:r>
+        <w:rPr>
+          <w:b/>
+        </w:rPr>
+        <w:t>Cada entregable tiene un resumen de 1 página para el otro.</w:t>
+      </w:r>
+      <w:r>
+        <w:rPr/>
+        <w:t xml:space="preserve"> Está como tarea en el cronograma; por ejemplo, el miércoles 14 tu resumen de bóvedas y RAG.</w:t>
+      </w:r>
+    </w:p>
+    <w:p>
+      <w:pPr>
+        <w:pStyle w:val="ListBullet"/>
+      </w:pPr>
+      <w:r>
+        <w:rPr>
+          <w:b/>
+        </w:rPr>
+        <w:t>Cada domingo en la noche hay revisión de la semana (1 h):</w:t>
+      </w:r>
+      <w:r>
+        <w:rPr/>
+        <w:t xml:space="preserve"> qué hicimos, qué no y qué aprendimos; </w:t>
+      </w:r>
+      <w:r>
+        <w:rPr>
+          <w:b/>
+        </w:rPr>
+        <w:t>20 minutos de «explícame lo tuyo»</w:t>
+      </w:r>
+      <w:r>
+        <w:rPr/>
+        <w:t>; y la planificación de la semana siguiente.</w:t>
+      </w:r>
+    </w:p>
+    <w:p>
+      <w:pPr>
+        <w:pStyle w:val="ListBullet"/>
+      </w:pPr>
+      <w:r>
+        <w:rPr/>
+        <w:t xml:space="preserve">Víctor te explica los conceptos de negocio con </w:t>
+      </w:r>
+      <w:r>
+        <w:rPr>
+          <w:rFonts w:ascii="Consolas" w:hAnsi="Consolas" w:cs="Consolas" w:eastAsia="Consolas"/>
+          <w:color w:val="0B1F3A"/>
+          <w:sz w:val="19"/>
+        </w:rPr>
+        <w:t>Conceptos_Negocio.pdf</w:t>
+      </w:r>
+      <w:r>
+        <w:rPr/>
+        <w:t xml:space="preserve"> (raíz del repo). Para cada concepto, ese documento dice qué tendrías que construir tú.</w:t>
+      </w:r>
+    </w:p>
+    <w:p>
+      <w:pPr>
+        <w:pStyle w:val="Heading1"/>
+        <w:pBdr>
+          <w:bottom w:val="single" w:sz="10" w:space="4" w:color="B87333"/>
+        </w:pBdr>
+      </w:pPr>
+      <w:r>
+        <w:t>6. Primera vez: instalar, iniciar sesión y clonar</w:t>
+      </w:r>
+    </w:p>
+    <w:p>
+      <w:pPr>
+        <w:pStyle w:val="ListNumber"/>
+      </w:pPr>
+      <w:r>
+        <w:rPr>
+          <w:b/>
+        </w:rPr>
+        <w:t>Acepta la invitación:</w:t>
+      </w:r>
+      <w:r>
+        <w:rPr/>
+        <w:t xml:space="preserve"> </w:t>
+      </w:r>
+      <w:hyperlink r:id="rId11">
+        <w:r>
+          <w:rPr>
+            <w:color w:val="B87333"/>
+            <w:u w:val="single"/>
+          </w:rPr>
+          <w:t xml:space="preserve">https://github.com/l333x/Tesis_Torvesa/invitations</w:t>
+        </w:r>
+      </w:hyperlink>
+      <w:r>
+        <w:rPr/>
+        <w:t xml:space="preserve"> → </w:t>
+      </w:r>
+      <w:r>
+        <w:rPr>
+          <w:i/>
+        </w:rPr>
+        <w:t>Accept</w:t>
+      </w:r>
+      <w:r>
+        <w:rPr/>
+        <w:t>. Caduca 7 días después del envío (11-oct).</w:t>
+      </w:r>
+    </w:p>
+    <w:p>
+      <w:pPr>
+        <w:pStyle w:val="ListNumber"/>
+      </w:pPr>
+      <w:r>
+        <w:rPr>
+          <w:b/>
+        </w:rPr>
+        <w:t>Instala</w:t>
+      </w:r>
+      <w:r>
+        <w:rPr/>
+        <w:t xml:space="preserve"> (PowerShell): </w:t>
+      </w:r>
+      <w:r>
+        <w:rPr>
+          <w:rFonts w:ascii="Consolas" w:hAnsi="Consolas" w:cs="Consolas" w:eastAsia="Consolas"/>
+          <w:color w:val="0B1F3A"/>
+          <w:sz w:val="19"/>
+        </w:rPr>
+        <w:t>winget install --id Git.Git -e</w:t>
+      </w:r>
+      <w:r>
+        <w:rPr/>
+        <w:t xml:space="preserve">, </w:t>
+      </w:r>
+      <w:r>
+        <w:rPr>
+          <w:rFonts w:ascii="Consolas" w:hAnsi="Consolas" w:cs="Consolas" w:eastAsia="Consolas"/>
+          <w:color w:val="0B1F3A"/>
+          <w:sz w:val="19"/>
+        </w:rPr>
+        <w:t>winget install --id GitHub.cli -e</w:t>
+      </w:r>
+      <w:r>
+        <w:rPr/>
+        <w:t xml:space="preserve">, </w:t>
+      </w:r>
+      <w:r>
+        <w:rPr>
+          <w:rFonts w:ascii="Consolas" w:hAnsi="Consolas" w:cs="Consolas" w:eastAsia="Consolas"/>
+          <w:color w:val="0B1F3A"/>
+          <w:sz w:val="19"/>
+        </w:rPr>
+        <w:t>winget install --id Python.Python.3.13 -e</w:t>
+      </w:r>
+      <w:r>
+        <w:rPr/>
+        <w:t xml:space="preserve">, </w:t>
+      </w:r>
+      <w:r>
+        <w:rPr>
+          <w:rFonts w:ascii="Consolas" w:hAnsi="Consolas" w:cs="Consolas" w:eastAsia="Consolas"/>
+          <w:color w:val="0B1F3A"/>
+          <w:sz w:val="19"/>
+        </w:rPr>
+        <w:t>winget install --id Obsidian.Obsidian -e</w:t>
+      </w:r>
+      <w:r>
+        <w:rPr/>
+        <w:t>.</w:t>
+      </w:r>
+    </w:p>
+    <w:p>
+      <w:pPr>
+        <w:pStyle w:val="ListNumber"/>
+      </w:pPr>
+      <w:r>
+        <w:rPr>
+          <w:b/>
+        </w:rPr>
+        <w:t>Inicia sesión:</w:t>
+      </w:r>
+      <w:r>
+        <w:rPr/>
+        <w:t xml:space="preserve"> </w:t>
+      </w:r>
+      <w:r>
+        <w:rPr>
+          <w:rFonts w:ascii="Consolas" w:hAnsi="Consolas" w:cs="Consolas" w:eastAsia="Consolas"/>
+          <w:color w:val="0B1F3A"/>
+          <w:sz w:val="19"/>
+        </w:rPr>
+        <w:t>gh auth login --hostname github.com --git-protocol ssh --web</w:t>
+      </w:r>
+      <w:r>
+        <w:rPr/>
+        <w:t>. Genera una clave nueva con tu propia contraseña de clave (passphrase) y autoriza en el navegador hasta ver «Congratulations».</w:t>
+      </w:r>
+    </w:p>
+    <w:p>
+      <w:pPr>
+        <w:pStyle w:val="ListNumber"/>
+      </w:pPr>
+      <w:r>
+        <w:rPr>
+          <w:b/>
+        </w:rPr>
+        <w:t>Clona</w:t>
+      </w:r>
+      <w:r>
+        <w:rPr/>
+        <w:t xml:space="preserve"> en una carpeta </w:t>
+      </w:r>
+      <w:r>
+        <w:rPr>
+          <w:b/>
+        </w:rPr>
+        <w:t>fuera de OneDrive</w:t>
+      </w:r>
+      <w:r>
+        <w:rPr/>
+        <w:t xml:space="preserve">: </w:t>
+      </w:r>
+      <w:r>
+        <w:rPr>
+          <w:rFonts w:ascii="Consolas" w:hAnsi="Consolas" w:cs="Consolas" w:eastAsia="Consolas"/>
+          <w:color w:val="0B1F3A"/>
+          <w:sz w:val="19"/>
+        </w:rPr>
+        <w:t>gh repo clone l333x/Tesis_Torvesa</w:t>
+      </w:r>
+      <w:r>
+        <w:rPr/>
+        <w:t>.</w:t>
+      </w:r>
+    </w:p>
+    <w:p>
+      <w:pPr>
+        <w:pStyle w:val="ListNumber"/>
+      </w:pPr>
+      <w:r>
+        <w:rPr>
+          <w:b/>
+        </w:rPr>
+        <w:t>Abre la carpeta en Obsidian:</w:t>
+      </w:r>
+      <w:r>
+        <w:rPr/>
+        <w:t xml:space="preserve"> </w:t>
+      </w:r>
+      <w:r>
+        <w:rPr>
+          <w:i/>
+        </w:rPr>
+        <w:t>Abrir carpeta como bóveda</w:t>
+      </w:r>
+      <w:r>
+        <w:rPr/>
+        <w:t>.</w:t>
+      </w:r>
+    </w:p>
+    <w:p>
+      <w:pPr>
+        <w:pStyle w:val="ListNumber"/>
+      </w:pPr>
+      <w:r>
+        <w:rPr>
+          <w:b/>
+        </w:rPr>
+        <w:t>Prueba:</w:t>
+      </w:r>
+      <w:r>
+        <w:rPr/>
+        <w:t xml:space="preserve"> crea </w:t>
+      </w:r>
+      <w:r>
+        <w:rPr>
+          <w:rFonts w:ascii="Consolas" w:hAnsi="Consolas" w:cs="Consolas" w:eastAsia="Consolas"/>
+          <w:color w:val="0B1F3A"/>
+          <w:sz w:val="19"/>
+        </w:rPr>
+        <w:t>00_Inbox/hola_diego.md</w:t>
+      </w:r>
+      <w:r>
+        <w:rPr/>
+        <w:t xml:space="preserve">, haz commit con </w:t>
+      </w:r>
+      <w:r>
+        <w:rPr>
+          <w:rFonts w:ascii="Consolas" w:hAnsi="Consolas" w:cs="Consolas" w:eastAsia="Consolas"/>
+          <w:color w:val="0B1F3A"/>
+          <w:sz w:val="19"/>
+        </w:rPr>
+        <w:t>S1-10: prueba (closes #10)</w:t>
+      </w:r>
+      <w:r>
+        <w:rPr/>
+        <w:t xml:space="preserve"> y push.</w:t>
+      </w:r>
+    </w:p>
+    <w:p>
+      <w:pPr>
+        <w:pStyle w:val="Heading1"/>
+        <w:pBdr>
+          <w:bottom w:val="single" w:sz="10" w:space="4" w:color="B87333"/>
+        </w:pBdr>
+      </w:pPr>
+      <w:r>
+        <w:t>7. Reglas</w:t>
+      </w:r>
+    </w:p>
+    <w:p>
+      <w:pPr>
+        <w:pStyle w:val="ListBullet"/>
+      </w:pPr>
+      <w:r>
+        <w:rPr>
+          <w:b/>
+        </w:rPr>
+        <w:t>Datos personales:</w:t>
+      </w:r>
+      <w:r>
+        <w:rPr/>
+        <w:t xml:space="preserve"> nunca en el repo. Nombres, teléfonos, correos, cédulas, audios y escaneos van a </w:t>
+      </w:r>
+      <w:r>
+        <w:rPr>
+          <w:rFonts w:ascii="Consolas" w:hAnsi="Consolas" w:cs="Consolas" w:eastAsia="Consolas"/>
+          <w:color w:val="0B1F3A"/>
+          <w:sz w:val="19"/>
+        </w:rPr>
+        <w:t>05_Datos_Campo/_crudo/</w:t>
+      </w:r>
+      <w:r>
+        <w:rPr/>
+        <w:t>, una carpeta que GitHub ignora.</w:t>
+      </w:r>
+    </w:p>
+    <w:p>
+      <w:pPr>
+        <w:pStyle w:val="ListBullet"/>
+      </w:pPr>
+      <w:r>
+        <w:rPr>
+          <w:b/>
+        </w:rPr>
+        <w:t>Antes de subir datos:</w:t>
+      </w:r>
+      <w:r>
+        <w:rPr/>
+        <w:t xml:space="preserve"> ejecuta </w:t>
+      </w:r>
+      <w:r>
+        <w:rPr>
+          <w:rFonts w:ascii="Consolas" w:hAnsi="Consolas" w:cs="Consolas" w:eastAsia="Consolas"/>
+          <w:color w:val="0B1F3A"/>
+          <w:sz w:val="19"/>
+        </w:rPr>
+        <w:t>python 99_Scripts/auditoria_pii.py</w:t>
+      </w:r>
+      <w:r>
+        <w:rPr/>
+        <w:t>. Tiene que decir «0 hallazgos».</w:t>
+      </w:r>
+    </w:p>
+    <w:p>
+      <w:pPr>
+        <w:pStyle w:val="ListBullet"/>
+      </w:pPr>
+      <w:r>
+        <w:rPr>
+          <w:b/>
+        </w:rPr>
+        <w:t>Nombres de archivo:</w:t>
+      </w:r>
+      <w:r>
+        <w:rPr/>
+        <w:t xml:space="preserve"> </w:t>
+      </w:r>
+      <w:r>
+        <w:rPr>
+          <w:rFonts w:ascii="Consolas" w:hAnsi="Consolas" w:cs="Consolas" w:eastAsia="Consolas"/>
+          <w:color w:val="0B1F3A"/>
+          <w:sz w:val="19"/>
+        </w:rPr>
+        <w:t>AAAA-MM-DD_tema_vX.Y</w:t>
+      </w:r>
+      <w:r>
+        <w:rPr/>
+        <w:t xml:space="preserve">, por ejemplo </w:t>
+      </w:r>
+      <w:r>
+        <w:rPr>
+          <w:rFonts w:ascii="Consolas" w:hAnsi="Consolas" w:cs="Consolas" w:eastAsia="Consolas"/>
+          <w:color w:val="0B1F3A"/>
+          <w:sz w:val="19"/>
+        </w:rPr>
+        <w:t>2026-11-04_TO-BE_Proceso1_v0.1.md</w:t>
+      </w:r>
+      <w:r>
+        <w:rPr/>
+        <w:t>.</w:t>
+      </w:r>
+    </w:p>
+    <w:p>
+      <w:pPr>
+        <w:pStyle w:val="ListBullet"/>
+      </w:pPr>
+      <w:r>
+        <w:rPr>
+          <w:b/>
+        </w:rPr>
+        <w:t>Mensaje de cada commit:</w:t>
+      </w:r>
+      <w:r>
+        <w:rPr/>
+        <w:t xml:space="preserve"> el código de la tarea y su issue, por ejemplo </w:t>
+      </w:r>
+      <w:r>
+        <w:rPr>
+          <w:rFonts w:ascii="Consolas" w:hAnsi="Consolas" w:cs="Consolas" w:eastAsia="Consolas"/>
+          <w:color w:val="0B1F3A"/>
+          <w:sz w:val="19"/>
+        </w:rPr>
+        <w:t>S1-13: 5 fichas de bóvedas (#54)</w:t>
+      </w:r>
+      <w:r>
+        <w:rPr/>
+        <w:t>.</w:t>
+      </w:r>
+    </w:p>
+    <w:p>
+      <w:pPr>
+        <w:pStyle w:val="ListBullet"/>
+      </w:pPr>
+      <w:r>
+        <w:rPr>
+          <w:b/>
+        </w:rPr>
+        <w:t>Uso de IA:</w:t>
+      </w:r>
+      <w:r>
+        <w:rPr/>
+        <w:t xml:space="preserve"> si una IA te ayudó, ponlo en el commit (</w:t>
+      </w:r>
+      <w:r>
+        <w:rPr>
+          <w:rFonts w:ascii="Consolas" w:hAnsi="Consolas" w:cs="Consolas" w:eastAsia="Consolas"/>
+          <w:color w:val="0B1F3A"/>
+          <w:sz w:val="19"/>
+        </w:rPr>
+        <w:t>[IA: Claude]</w:t>
+      </w:r>
+      <w:r>
+        <w:rPr/>
+        <w:t xml:space="preserve">) y en </w:t>
+      </w:r>
+      <w:r>
+        <w:rPr>
+          <w:rFonts w:ascii="Consolas" w:hAnsi="Consolas" w:cs="Consolas" w:eastAsia="Consolas"/>
+          <w:color w:val="0B1F3A"/>
+          <w:sz w:val="19"/>
+        </w:rPr>
+        <w:t>09_Registro_Contribuciones</w:t>
+      </w:r>
+      <w:r>
+        <w:rPr/>
+        <w:t>.</w:t>
+      </w:r>
+    </w:p>
+    <w:p>
+      <w:pPr>
+        <w:pStyle w:val="ListBullet"/>
+      </w:pPr>
+      <w:r>
+        <w:rPr>
+          <w:b/>
+        </w:rPr>
+        <w:t>Nunca</w:t>
+      </w:r>
+      <w:r>
+        <w:rPr/>
+        <w:t xml:space="preserve"> </w:t>
+      </w:r>
+      <w:r>
+        <w:rPr>
+          <w:rFonts w:ascii="Consolas" w:hAnsi="Consolas" w:cs="Consolas" w:eastAsia="Consolas"/>
+          <w:color w:val="0B1F3A"/>
+          <w:sz w:val="19"/>
+        </w:rPr>
+        <w:t>git push --force</w:t>
+      </w:r>
+      <w:r>
+        <w:rPr/>
+        <w:t>, ni mover o renombrar carpetas de Víctor sin avisar.</w:t>
+      </w:r>
+    </w:p>
+    <w:p>
+      <w:pPr>
+        <w:pStyle w:val="Heading1"/>
+        <w:pBdr>
+          <w:bottom w:val="single" w:sz="10" w:space="4" w:color="B87333"/>
+        </w:pBdr>
+      </w:pPr>
+      <w:r>
+        <w:t>8. Cómo reportar y a quién preguntar</w:t>
+      </w:r>
+    </w:p>
+    <w:p>
+      <w:pPr>
+        <w:pStyle w:val="ListBullet"/>
+      </w:pPr>
+      <w:r>
+        <w:rPr>
+          <w:b/>
+        </w:rPr>
+        <w:t>Durante la semana:</w:t>
+      </w:r>
+      <w:r>
+        <w:rPr/>
+        <w:t xml:space="preserve"> marca el estado de tus tareas en el Excel del cronograma y comenta en el issue lo que te bloquee.</w:t>
+      </w:r>
+    </w:p>
+    <w:p>
+      <w:pPr>
+        <w:pStyle w:val="ListBullet"/>
+      </w:pPr>
+      <w:r>
+        <w:rPr>
+          <w:b/>
+        </w:rPr>
+        <w:t>Domingo antes de las 21:00:</w:t>
+      </w:r>
+      <w:r>
+        <w:rPr/>
+        <w:t xml:space="preserve"> todo subido. A esa hora se genera solo el informe semanal y se actualiza el Documento madre.</w:t>
+      </w:r>
+    </w:p>
+    <w:p>
+      <w:pPr>
+        <w:pStyle w:val="ListBullet"/>
+      </w:pPr>
+      <w:r>
+        <w:rPr>
+          <w:b/>
+        </w:rPr>
+        <w:t>Pregúntale a Víctor:</w:t>
+      </w:r>
+      <w:r>
+        <w:rPr/>
+        <w:t xml:space="preserve"> lo del negocio, la tutora, Torvesa, las fuentes y la tesis.</w:t>
+      </w:r>
+    </w:p>
+    <w:p>
+      <w:pPr>
+        <w:pStyle w:val="ListBullet"/>
+      </w:pPr>
+      <w:r>
+        <w:rPr>
+          <w:b/>
+        </w:rPr>
+        <w:t>Decides tú:</w:t>
+      </w:r>
+      <w:r>
+        <w:rPr/>
+        <w:t xml:space="preserve"> lo técnico; avísale a Víctor si cambia el alcance.</w:t>
+      </w:r>
+    </w:p>
+    <w:p>
+      <w:pPr>
+        <w:pStyle w:val="ListBullet"/>
+      </w:pPr>
+      <w:r>
+        <w:rPr>
+          <w:b/>
+        </w:rPr>
+        <w:t>Ante la duda sobre si algo es dato personal:</w:t>
+      </w:r>
+      <w:r>
+        <w:rPr/>
+        <w:t xml:space="preserve"> trátalo como si lo fuera.</w:t>
+      </w:r>
+    </w:p>
     <w:sectPr>
       <w:footerReference w:type="default" r:id="rId9"/>
       <w:pgSz w:w="12240" w:h="15840"/>

</xml_diff>